<commit_message>
Add distortion-augmented U-Net (M3-R) to close 37+ robustness gap
- Add distortion_augment parameter to Method3Segmenter: when True,
  randomly applies one of four distortion types (noise σ~[10,45],
  blur σ~[1.0,3.5], brightness/contrast factor~[0.35,0.75]) to 70%
  of training images, covering the full range of robustness test conditions
- Add configs/method_3_robust_ews.json for the robust training variant
- Update run_robustness.py to include method_3_robust in benchmarks
- Update TABLE III in report with M3-R column showing improvements:
  extreme contrast IoU 0.596 → 0.762 (+0.166), noise σ=40: 0.728 → 0.772
- Update Discussion/Conclusion to reflect the analysis→improvement loop

Co-Authored-By: Claude Sonnet 4.6 <noreply@anthropic.com>
</commit_message>
<xml_diff>
--- a/reports/COMP9517_Group_Project_Report.docx
+++ b/reports/COMP9517_Group_Project_Report.docx
@@ -2413,7 +2413,7 @@
           <w:sz w:val="20"/>
           <w:szCs w:val="20"/>
         </w:rPr>
-        <w:t xml:space="preserve">To simulate real-world image degradation, we apply four distortion types to the test set: Gaussian noise (σ = 15 and σ = 40), Gaussian blur (σ = 1.5 and σ = 3.0), brightness reduction (×0.7 and ×0.4), and contrast reduction (×0.7 and ×0.4). Each method is trained once on clean data; only inference uses distorted images. Table III reports IoU.</w:t>
+        <w:t xml:space="preserve">To simulate real-world image degradation, we apply four distortion types to the test set: Gaussian noise (σ = 15 and σ = 40), Gaussian blur (σ = 1.5 and σ = 3.0), brightness reduction (×0.7 and ×0.4), and contrast reduction (×0.7 and ×0.4). Each method is trained once on clean data. Table III also includes M3-R, a U-Net variant trained with strong distortion augmentation (noise σ∼[10,45], blur σ∼[1.0,3.5], brightness/contrast factor∼[0.35,0.75] applied randomly at 70% probability).</w:t>
       </w:r>
     </w:p>
     <w:p>
@@ -2449,7 +2449,7 @@
           <w:sz w:val="16"/>
           <w:szCs w:val="16"/>
         </w:rPr>
-        <w:t xml:space="preserve">IoU under image distortions (trained on clean data).</w:t>
+        <w:t xml:space="preserve">IoU under image distortions. M3-R = U-Net with distortion augmentation.</w:t>
       </w:r>
     </w:p>
     <w:tbl>
@@ -2465,15 +2465,16 @@
         </w:tblBorders>
       </w:tblPr>
       <w:tblGrid>
-        <w:gridCol w:w="2000"/>
-        <w:gridCol w:w="960"/>
-        <w:gridCol w:w="960"/>
-        <w:gridCol w:w="960"/>
+        <w:gridCol w:w="1811"/>
+        <w:gridCol w:w="746"/>
+        <w:gridCol w:w="746"/>
+        <w:gridCol w:w="746"/>
+        <w:gridCol w:w="831"/>
       </w:tblGrid>
       <w:tr>
         <w:tc>
           <w:tcPr>
-            <w:tcW w:type="dxa" w:w="2000"/>
+            <w:tcW w:type="dxa" w:w="1811"/>
             <w:tcBorders>
               <w:top w:val="single" w:color="000000" w:sz="12"/>
               <w:left w:val="none" w:color="FFFFFF" w:sz="0"/>
@@ -2509,7 +2510,7 @@
         </w:tc>
         <w:tc>
           <w:tcPr>
-            <w:tcW w:type="dxa" w:w="960"/>
+            <w:tcW w:type="dxa" w:w="746"/>
             <w:tcBorders>
               <w:top w:val="single" w:color="000000" w:sz="12"/>
               <w:left w:val="none" w:color="FFFFFF" w:sz="0"/>
@@ -2539,13 +2540,13 @@
                 <w:sz w:val="16"/>
                 <w:szCs w:val="16"/>
               </w:rPr>
-              <w:t xml:space="preserve">M1 IoU</w:t>
-            </w:r>
-          </w:p>
-        </w:tc>
-        <w:tc>
-          <w:tcPr>
-            <w:tcW w:type="dxa" w:w="960"/>
+              <w:t xml:space="preserve">M1</w:t>
+            </w:r>
+          </w:p>
+        </w:tc>
+        <w:tc>
+          <w:tcPr>
+            <w:tcW w:type="dxa" w:w="746"/>
             <w:tcBorders>
               <w:top w:val="single" w:color="000000" w:sz="12"/>
               <w:left w:val="none" w:color="FFFFFF" w:sz="0"/>
@@ -2575,13 +2576,13 @@
                 <w:sz w:val="16"/>
                 <w:szCs w:val="16"/>
               </w:rPr>
-              <w:t xml:space="preserve">M2 IoU</w:t>
-            </w:r>
-          </w:p>
-        </w:tc>
-        <w:tc>
-          <w:tcPr>
-            <w:tcW w:type="dxa" w:w="960"/>
+              <w:t xml:space="preserve">M2</w:t>
+            </w:r>
+          </w:p>
+        </w:tc>
+        <w:tc>
+          <w:tcPr>
+            <w:tcW w:type="dxa" w:w="746"/>
             <w:tcBorders>
               <w:top w:val="single" w:color="000000" w:sz="12"/>
               <w:left w:val="none" w:color="FFFFFF" w:sz="0"/>
@@ -2611,7 +2612,43 @@
                 <w:sz w:val="16"/>
                 <w:szCs w:val="16"/>
               </w:rPr>
-              <w:t xml:space="preserve">M3 IoU</w:t>
+              <w:t xml:space="preserve">M3</w:t>
+            </w:r>
+          </w:p>
+        </w:tc>
+        <w:tc>
+          <w:tcPr>
+            <w:tcW w:type="dxa" w:w="831"/>
+            <w:tcBorders>
+              <w:top w:val="single" w:color="000000" w:sz="12"/>
+              <w:left w:val="none" w:color="FFFFFF" w:sz="0"/>
+              <w:bottom w:val="single" w:color="000000" w:sz="4"/>
+              <w:right w:val="none" w:color="FFFFFF" w:sz="0"/>
+            </w:tcBorders>
+            <w:shd w:fill="FFFFFF" w:val="clear"/>
+            <w:tcMar>
+              <w:top w:type="dxa" w:w="40"/>
+              <w:left w:type="dxa" w:w="80"/>
+              <w:bottom w:type="dxa" w:w="40"/>
+              <w:right w:type="dxa" w:w="80"/>
+            </w:tcMar>
+          </w:tcPr>
+          <w:p>
+            <w:pPr>
+              <w:spacing w:after="0" w:before="0" w:line="240"/>
+              <w:ind w:firstLine="0"/>
+              <w:jc w:val="center"/>
+            </w:pPr>
+            <w:r>
+              <w:rPr>
+                <w:rFonts w:ascii="Times New Roman" w:cs="Times New Roman" w:eastAsia="Times New Roman" w:hAnsi="Times New Roman"/>
+                <w:b/>
+                <w:bCs/>
+                <w:caps w:val="false"/>
+                <w:sz w:val="16"/>
+                <w:szCs w:val="16"/>
+              </w:rPr>
+              <w:t xml:space="preserve">M3-R</w:t>
             </w:r>
           </w:p>
         </w:tc>
@@ -2619,7 +2656,7 @@
       <w:tr>
         <w:tc>
           <w:tcPr>
-            <w:tcW w:type="dxa" w:w="2000"/>
+            <w:tcW w:type="dxa" w:w="1811"/>
             <w:tcBorders>
               <w:top w:val="none" w:color="FFFFFF" w:sz="0"/>
               <w:left w:val="none" w:color="FFFFFF" w:sz="0"/>
@@ -2655,7 +2692,7 @@
         </w:tc>
         <w:tc>
           <w:tcPr>
-            <w:tcW w:type="dxa" w:w="960"/>
+            <w:tcW w:type="dxa" w:w="746"/>
             <w:tcBorders>
               <w:top w:val="none" w:color="FFFFFF" w:sz="0"/>
               <w:left w:val="none" w:color="FFFFFF" w:sz="0"/>
@@ -2691,7 +2728,7 @@
         </w:tc>
         <w:tc>
           <w:tcPr>
-            <w:tcW w:type="dxa" w:w="960"/>
+            <w:tcW w:type="dxa" w:w="746"/>
             <w:tcBorders>
               <w:top w:val="none" w:color="FFFFFF" w:sz="0"/>
               <w:left w:val="none" w:color="FFFFFF" w:sz="0"/>
@@ -2727,7 +2764,7 @@
         </w:tc>
         <w:tc>
           <w:tcPr>
-            <w:tcW w:type="dxa" w:w="960"/>
+            <w:tcW w:type="dxa" w:w="746"/>
             <w:tcBorders>
               <w:top w:val="none" w:color="FFFFFF" w:sz="0"/>
               <w:left w:val="none" w:color="FFFFFF" w:sz="0"/>
@@ -2758,6 +2795,42 @@
                 <w:szCs w:val="16"/>
               </w:rPr>
               <w:t xml:space="preserve">0.874</w:t>
+            </w:r>
+          </w:p>
+        </w:tc>
+        <w:tc>
+          <w:tcPr>
+            <w:tcW w:type="dxa" w:w="831"/>
+            <w:tcBorders>
+              <w:top w:val="none" w:color="FFFFFF" w:sz="0"/>
+              <w:left w:val="none" w:color="FFFFFF" w:sz="0"/>
+              <w:bottom w:val="none" w:color="FFFFFF" w:sz="0"/>
+              <w:right w:val="none" w:color="FFFFFF" w:sz="0"/>
+            </w:tcBorders>
+            <w:shd w:fill="FFFFFF" w:val="clear"/>
+            <w:tcMar>
+              <w:top w:type="dxa" w:w="40"/>
+              <w:left w:type="dxa" w:w="80"/>
+              <w:bottom w:type="dxa" w:w="40"/>
+              <w:right w:type="dxa" w:w="80"/>
+            </w:tcMar>
+          </w:tcPr>
+          <w:p>
+            <w:pPr>
+              <w:spacing w:after="0" w:before="0" w:line="240"/>
+              <w:ind w:firstLine="0"/>
+              <w:jc w:val="center"/>
+            </w:pPr>
+            <w:r>
+              <w:rPr>
+                <w:rFonts w:ascii="Times New Roman" w:cs="Times New Roman" w:eastAsia="Times New Roman" w:hAnsi="Times New Roman"/>
+                <w:b w:val="false"/>
+                <w:bCs w:val="false"/>
+                <w:caps w:val="false"/>
+                <w:sz w:val="16"/>
+                <w:szCs w:val="16"/>
+              </w:rPr>
+              <w:t xml:space="preserve">0.861</w:t>
             </w:r>
           </w:p>
         </w:tc>
@@ -2765,7 +2838,7 @@
       <w:tr>
         <w:tc>
           <w:tcPr>
-            <w:tcW w:type="dxa" w:w="2000"/>
+            <w:tcW w:type="dxa" w:w="1811"/>
             <w:tcBorders>
               <w:top w:val="none" w:color="FFFFFF" w:sz="0"/>
               <w:left w:val="none" w:color="FFFFFF" w:sz="0"/>
@@ -2801,7 +2874,7 @@
         </w:tc>
         <w:tc>
           <w:tcPr>
-            <w:tcW w:type="dxa" w:w="960"/>
+            <w:tcW w:type="dxa" w:w="746"/>
             <w:tcBorders>
               <w:top w:val="none" w:color="FFFFFF" w:sz="0"/>
               <w:left w:val="none" w:color="FFFFFF" w:sz="0"/>
@@ -2837,7 +2910,7 @@
         </w:tc>
         <w:tc>
           <w:tcPr>
-            <w:tcW w:type="dxa" w:w="960"/>
+            <w:tcW w:type="dxa" w:w="746"/>
             <w:tcBorders>
               <w:top w:val="none" w:color="FFFFFF" w:sz="0"/>
               <w:left w:val="none" w:color="FFFFFF" w:sz="0"/>
@@ -2873,7 +2946,7 @@
         </w:tc>
         <w:tc>
           <w:tcPr>
-            <w:tcW w:type="dxa" w:w="960"/>
+            <w:tcW w:type="dxa" w:w="746"/>
             <w:tcBorders>
               <w:top w:val="none" w:color="FFFFFF" w:sz="0"/>
               <w:left w:val="none" w:color="FFFFFF" w:sz="0"/>
@@ -2904,6 +2977,42 @@
                 <w:szCs w:val="16"/>
               </w:rPr>
               <w:t xml:space="preserve">0.831</w:t>
+            </w:r>
+          </w:p>
+        </w:tc>
+        <w:tc>
+          <w:tcPr>
+            <w:tcW w:type="dxa" w:w="831"/>
+            <w:tcBorders>
+              <w:top w:val="none" w:color="FFFFFF" w:sz="0"/>
+              <w:left w:val="none" w:color="FFFFFF" w:sz="0"/>
+              <w:bottom w:val="none" w:color="FFFFFF" w:sz="0"/>
+              <w:right w:val="none" w:color="FFFFFF" w:sz="0"/>
+            </w:tcBorders>
+            <w:shd w:fill="FFFFFF" w:val="clear"/>
+            <w:tcMar>
+              <w:top w:type="dxa" w:w="40"/>
+              <w:left w:type="dxa" w:w="80"/>
+              <w:bottom w:type="dxa" w:w="40"/>
+              <w:right w:type="dxa" w:w="80"/>
+            </w:tcMar>
+          </w:tcPr>
+          <w:p>
+            <w:pPr>
+              <w:spacing w:after="0" w:before="0" w:line="240"/>
+              <w:ind w:firstLine="0"/>
+              <w:jc w:val="center"/>
+            </w:pPr>
+            <w:r>
+              <w:rPr>
+                <w:rFonts w:ascii="Times New Roman" w:cs="Times New Roman" w:eastAsia="Times New Roman" w:hAnsi="Times New Roman"/>
+                <w:b w:val="false"/>
+                <w:bCs w:val="false"/>
+                <w:caps w:val="false"/>
+                <w:sz w:val="16"/>
+                <w:szCs w:val="16"/>
+              </w:rPr>
+              <w:t xml:space="preserve">0.838</w:t>
             </w:r>
           </w:p>
         </w:tc>
@@ -2911,7 +3020,7 @@
       <w:tr>
         <w:tc>
           <w:tcPr>
-            <w:tcW w:type="dxa" w:w="2000"/>
+            <w:tcW w:type="dxa" w:w="1811"/>
             <w:tcBorders>
               <w:top w:val="none" w:color="FFFFFF" w:sz="0"/>
               <w:left w:val="none" w:color="FFFFFF" w:sz="0"/>
@@ -2947,7 +3056,7 @@
         </w:tc>
         <w:tc>
           <w:tcPr>
-            <w:tcW w:type="dxa" w:w="960"/>
+            <w:tcW w:type="dxa" w:w="746"/>
             <w:tcBorders>
               <w:top w:val="none" w:color="FFFFFF" w:sz="0"/>
               <w:left w:val="none" w:color="FFFFFF" w:sz="0"/>
@@ -2983,7 +3092,7 @@
         </w:tc>
         <w:tc>
           <w:tcPr>
-            <w:tcW w:type="dxa" w:w="960"/>
+            <w:tcW w:type="dxa" w:w="746"/>
             <w:tcBorders>
               <w:top w:val="none" w:color="FFFFFF" w:sz="0"/>
               <w:left w:val="none" w:color="FFFFFF" w:sz="0"/>
@@ -3019,7 +3128,7 @@
         </w:tc>
         <w:tc>
           <w:tcPr>
-            <w:tcW w:type="dxa" w:w="960"/>
+            <w:tcW w:type="dxa" w:w="746"/>
             <w:tcBorders>
               <w:top w:val="none" w:color="FFFFFF" w:sz="0"/>
               <w:left w:val="none" w:color="FFFFFF" w:sz="0"/>
@@ -3050,6 +3159,42 @@
                 <w:szCs w:val="16"/>
               </w:rPr>
               <w:t xml:space="preserve">0.728</w:t>
+            </w:r>
+          </w:p>
+        </w:tc>
+        <w:tc>
+          <w:tcPr>
+            <w:tcW w:type="dxa" w:w="831"/>
+            <w:tcBorders>
+              <w:top w:val="none" w:color="FFFFFF" w:sz="0"/>
+              <w:left w:val="none" w:color="FFFFFF" w:sz="0"/>
+              <w:bottom w:val="none" w:color="FFFFFF" w:sz="0"/>
+              <w:right w:val="none" w:color="FFFFFF" w:sz="0"/>
+            </w:tcBorders>
+            <w:shd w:fill="FFFFFF" w:val="clear"/>
+            <w:tcMar>
+              <w:top w:type="dxa" w:w="40"/>
+              <w:left w:type="dxa" w:w="80"/>
+              <w:bottom w:type="dxa" w:w="40"/>
+              <w:right w:type="dxa" w:w="80"/>
+            </w:tcMar>
+          </w:tcPr>
+          <w:p>
+            <w:pPr>
+              <w:spacing w:after="0" w:before="0" w:line="240"/>
+              <w:ind w:firstLine="0"/>
+              <w:jc w:val="center"/>
+            </w:pPr>
+            <w:r>
+              <w:rPr>
+                <w:rFonts w:ascii="Times New Roman" w:cs="Times New Roman" w:eastAsia="Times New Roman" w:hAnsi="Times New Roman"/>
+                <w:b w:val="false"/>
+                <w:bCs w:val="false"/>
+                <w:caps w:val="false"/>
+                <w:sz w:val="16"/>
+                <w:szCs w:val="16"/>
+              </w:rPr>
+              <w:t xml:space="preserve">0.772</w:t>
             </w:r>
           </w:p>
         </w:tc>
@@ -3057,7 +3202,7 @@
       <w:tr>
         <w:tc>
           <w:tcPr>
-            <w:tcW w:type="dxa" w:w="2000"/>
+            <w:tcW w:type="dxa" w:w="1811"/>
             <w:tcBorders>
               <w:top w:val="none" w:color="FFFFFF" w:sz="0"/>
               <w:left w:val="none" w:color="FFFFFF" w:sz="0"/>
@@ -3093,7 +3238,7 @@
         </w:tc>
         <w:tc>
           <w:tcPr>
-            <w:tcW w:type="dxa" w:w="960"/>
+            <w:tcW w:type="dxa" w:w="746"/>
             <w:tcBorders>
               <w:top w:val="none" w:color="FFFFFF" w:sz="0"/>
               <w:left w:val="none" w:color="FFFFFF" w:sz="0"/>
@@ -3129,7 +3274,7 @@
         </w:tc>
         <w:tc>
           <w:tcPr>
-            <w:tcW w:type="dxa" w:w="960"/>
+            <w:tcW w:type="dxa" w:w="746"/>
             <w:tcBorders>
               <w:top w:val="none" w:color="FFFFFF" w:sz="0"/>
               <w:left w:val="none" w:color="FFFFFF" w:sz="0"/>
@@ -3165,7 +3310,7 @@
         </w:tc>
         <w:tc>
           <w:tcPr>
-            <w:tcW w:type="dxa" w:w="960"/>
+            <w:tcW w:type="dxa" w:w="746"/>
             <w:tcBorders>
               <w:top w:val="none" w:color="FFFFFF" w:sz="0"/>
               <w:left w:val="none" w:color="FFFFFF" w:sz="0"/>
@@ -3196,6 +3341,42 @@
                 <w:szCs w:val="16"/>
               </w:rPr>
               <w:t xml:space="preserve">0.864</w:t>
+            </w:r>
+          </w:p>
+        </w:tc>
+        <w:tc>
+          <w:tcPr>
+            <w:tcW w:type="dxa" w:w="831"/>
+            <w:tcBorders>
+              <w:top w:val="none" w:color="FFFFFF" w:sz="0"/>
+              <w:left w:val="none" w:color="FFFFFF" w:sz="0"/>
+              <w:bottom w:val="none" w:color="FFFFFF" w:sz="0"/>
+              <w:right w:val="none" w:color="FFFFFF" w:sz="0"/>
+            </w:tcBorders>
+            <w:shd w:fill="FFFFFF" w:val="clear"/>
+            <w:tcMar>
+              <w:top w:type="dxa" w:w="40"/>
+              <w:left w:type="dxa" w:w="80"/>
+              <w:bottom w:type="dxa" w:w="40"/>
+              <w:right w:type="dxa" w:w="80"/>
+            </w:tcMar>
+          </w:tcPr>
+          <w:p>
+            <w:pPr>
+              <w:spacing w:after="0" w:before="0" w:line="240"/>
+              <w:ind w:firstLine="0"/>
+              <w:jc w:val="center"/>
+            </w:pPr>
+            <w:r>
+              <w:rPr>
+                <w:rFonts w:ascii="Times New Roman" w:cs="Times New Roman" w:eastAsia="Times New Roman" w:hAnsi="Times New Roman"/>
+                <w:b w:val="false"/>
+                <w:bCs w:val="false"/>
+                <w:caps w:val="false"/>
+                <w:sz w:val="16"/>
+                <w:szCs w:val="16"/>
+              </w:rPr>
+              <w:t xml:space="preserve">0.854</w:t>
             </w:r>
           </w:p>
         </w:tc>
@@ -3203,7 +3384,7 @@
       <w:tr>
         <w:tc>
           <w:tcPr>
-            <w:tcW w:type="dxa" w:w="2000"/>
+            <w:tcW w:type="dxa" w:w="1811"/>
             <w:tcBorders>
               <w:top w:val="none" w:color="FFFFFF" w:sz="0"/>
               <w:left w:val="none" w:color="FFFFFF" w:sz="0"/>
@@ -3239,7 +3420,7 @@
         </w:tc>
         <w:tc>
           <w:tcPr>
-            <w:tcW w:type="dxa" w:w="960"/>
+            <w:tcW w:type="dxa" w:w="746"/>
             <w:tcBorders>
               <w:top w:val="none" w:color="FFFFFF" w:sz="0"/>
               <w:left w:val="none" w:color="FFFFFF" w:sz="0"/>
@@ -3275,7 +3456,7 @@
         </w:tc>
         <w:tc>
           <w:tcPr>
-            <w:tcW w:type="dxa" w:w="960"/>
+            <w:tcW w:type="dxa" w:w="746"/>
             <w:tcBorders>
               <w:top w:val="none" w:color="FFFFFF" w:sz="0"/>
               <w:left w:val="none" w:color="FFFFFF" w:sz="0"/>
@@ -3311,7 +3492,7 @@
         </w:tc>
         <w:tc>
           <w:tcPr>
-            <w:tcW w:type="dxa" w:w="960"/>
+            <w:tcW w:type="dxa" w:w="746"/>
             <w:tcBorders>
               <w:top w:val="none" w:color="FFFFFF" w:sz="0"/>
               <w:left w:val="none" w:color="FFFFFF" w:sz="0"/>
@@ -3342,6 +3523,42 @@
                 <w:szCs w:val="16"/>
               </w:rPr>
               <w:t xml:space="preserve">0.815</w:t>
+            </w:r>
+          </w:p>
+        </w:tc>
+        <w:tc>
+          <w:tcPr>
+            <w:tcW w:type="dxa" w:w="831"/>
+            <w:tcBorders>
+              <w:top w:val="none" w:color="FFFFFF" w:sz="0"/>
+              <w:left w:val="none" w:color="FFFFFF" w:sz="0"/>
+              <w:bottom w:val="none" w:color="FFFFFF" w:sz="0"/>
+              <w:right w:val="none" w:color="FFFFFF" w:sz="0"/>
+            </w:tcBorders>
+            <w:shd w:fill="FFFFFF" w:val="clear"/>
+            <w:tcMar>
+              <w:top w:type="dxa" w:w="40"/>
+              <w:left w:type="dxa" w:w="80"/>
+              <w:bottom w:type="dxa" w:w="40"/>
+              <w:right w:type="dxa" w:w="80"/>
+            </w:tcMar>
+          </w:tcPr>
+          <w:p>
+            <w:pPr>
+              <w:spacing w:after="0" w:before="0" w:line="240"/>
+              <w:ind w:firstLine="0"/>
+              <w:jc w:val="center"/>
+            </w:pPr>
+            <w:r>
+              <w:rPr>
+                <w:rFonts w:ascii="Times New Roman" w:cs="Times New Roman" w:eastAsia="Times New Roman" w:hAnsi="Times New Roman"/>
+                <w:b w:val="false"/>
+                <w:bCs w:val="false"/>
+                <w:caps w:val="false"/>
+                <w:sz w:val="16"/>
+                <w:szCs w:val="16"/>
+              </w:rPr>
+              <w:t xml:space="preserve">0.833</w:t>
             </w:r>
           </w:p>
         </w:tc>
@@ -3349,7 +3566,7 @@
       <w:tr>
         <w:tc>
           <w:tcPr>
-            <w:tcW w:type="dxa" w:w="2000"/>
+            <w:tcW w:type="dxa" w:w="1811"/>
             <w:tcBorders>
               <w:top w:val="none" w:color="FFFFFF" w:sz="0"/>
               <w:left w:val="none" w:color="FFFFFF" w:sz="0"/>
@@ -3385,7 +3602,7 @@
         </w:tc>
         <w:tc>
           <w:tcPr>
-            <w:tcW w:type="dxa" w:w="960"/>
+            <w:tcW w:type="dxa" w:w="746"/>
             <w:tcBorders>
               <w:top w:val="none" w:color="FFFFFF" w:sz="0"/>
               <w:left w:val="none" w:color="FFFFFF" w:sz="0"/>
@@ -3421,7 +3638,7 @@
         </w:tc>
         <w:tc>
           <w:tcPr>
-            <w:tcW w:type="dxa" w:w="960"/>
+            <w:tcW w:type="dxa" w:w="746"/>
             <w:tcBorders>
               <w:top w:val="none" w:color="FFFFFF" w:sz="0"/>
               <w:left w:val="none" w:color="FFFFFF" w:sz="0"/>
@@ -3457,7 +3674,7 @@
         </w:tc>
         <w:tc>
           <w:tcPr>
-            <w:tcW w:type="dxa" w:w="960"/>
+            <w:tcW w:type="dxa" w:w="746"/>
             <w:tcBorders>
               <w:top w:val="none" w:color="FFFFFF" w:sz="0"/>
               <w:left w:val="none" w:color="FFFFFF" w:sz="0"/>
@@ -3488,6 +3705,42 @@
                 <w:szCs w:val="16"/>
               </w:rPr>
               <w:t xml:space="preserve">0.844</w:t>
+            </w:r>
+          </w:p>
+        </w:tc>
+        <w:tc>
+          <w:tcPr>
+            <w:tcW w:type="dxa" w:w="831"/>
+            <w:tcBorders>
+              <w:top w:val="none" w:color="FFFFFF" w:sz="0"/>
+              <w:left w:val="none" w:color="FFFFFF" w:sz="0"/>
+              <w:bottom w:val="none" w:color="FFFFFF" w:sz="0"/>
+              <w:right w:val="none" w:color="FFFFFF" w:sz="0"/>
+            </w:tcBorders>
+            <w:shd w:fill="FFFFFF" w:val="clear"/>
+            <w:tcMar>
+              <w:top w:type="dxa" w:w="40"/>
+              <w:left w:type="dxa" w:w="80"/>
+              <w:bottom w:type="dxa" w:w="40"/>
+              <w:right w:type="dxa" w:w="80"/>
+            </w:tcMar>
+          </w:tcPr>
+          <w:p>
+            <w:pPr>
+              <w:spacing w:after="0" w:before="0" w:line="240"/>
+              <w:ind w:firstLine="0"/>
+              <w:jc w:val="center"/>
+            </w:pPr>
+            <w:r>
+              <w:rPr>
+                <w:rFonts w:ascii="Times New Roman" w:cs="Times New Roman" w:eastAsia="Times New Roman" w:hAnsi="Times New Roman"/>
+                <w:b w:val="false"/>
+                <w:bCs w:val="false"/>
+                <w:caps w:val="false"/>
+                <w:sz w:val="16"/>
+                <w:szCs w:val="16"/>
+              </w:rPr>
+              <w:t xml:space="preserve">0.806</w:t>
             </w:r>
           </w:p>
         </w:tc>
@@ -3495,7 +3748,7 @@
       <w:tr>
         <w:tc>
           <w:tcPr>
-            <w:tcW w:type="dxa" w:w="2000"/>
+            <w:tcW w:type="dxa" w:w="1811"/>
             <w:tcBorders>
               <w:top w:val="none" w:color="FFFFFF" w:sz="0"/>
               <w:left w:val="none" w:color="FFFFFF" w:sz="0"/>
@@ -3531,7 +3784,7 @@
         </w:tc>
         <w:tc>
           <w:tcPr>
-            <w:tcW w:type="dxa" w:w="960"/>
+            <w:tcW w:type="dxa" w:w="746"/>
             <w:tcBorders>
               <w:top w:val="none" w:color="FFFFFF" w:sz="0"/>
               <w:left w:val="none" w:color="FFFFFF" w:sz="0"/>
@@ -3567,7 +3820,7 @@
         </w:tc>
         <w:tc>
           <w:tcPr>
-            <w:tcW w:type="dxa" w:w="960"/>
+            <w:tcW w:type="dxa" w:w="746"/>
             <w:tcBorders>
               <w:top w:val="none" w:color="FFFFFF" w:sz="0"/>
               <w:left w:val="none" w:color="FFFFFF" w:sz="0"/>
@@ -3603,7 +3856,7 @@
         </w:tc>
         <w:tc>
           <w:tcPr>
-            <w:tcW w:type="dxa" w:w="960"/>
+            <w:tcW w:type="dxa" w:w="746"/>
             <w:tcBorders>
               <w:top w:val="none" w:color="FFFFFF" w:sz="0"/>
               <w:left w:val="none" w:color="FFFFFF" w:sz="0"/>
@@ -3634,6 +3887,42 @@
                 <w:szCs w:val="16"/>
               </w:rPr>
               <w:t xml:space="preserve">0.739</w:t>
+            </w:r>
+          </w:p>
+        </w:tc>
+        <w:tc>
+          <w:tcPr>
+            <w:tcW w:type="dxa" w:w="831"/>
+            <w:tcBorders>
+              <w:top w:val="none" w:color="FFFFFF" w:sz="0"/>
+              <w:left w:val="none" w:color="FFFFFF" w:sz="0"/>
+              <w:bottom w:val="none" w:color="FFFFFF" w:sz="0"/>
+              <w:right w:val="none" w:color="FFFFFF" w:sz="0"/>
+            </w:tcBorders>
+            <w:shd w:fill="FFFFFF" w:val="clear"/>
+            <w:tcMar>
+              <w:top w:type="dxa" w:w="40"/>
+              <w:left w:type="dxa" w:w="80"/>
+              <w:bottom w:type="dxa" w:w="40"/>
+              <w:right w:type="dxa" w:w="80"/>
+            </w:tcMar>
+          </w:tcPr>
+          <w:p>
+            <w:pPr>
+              <w:spacing w:after="0" w:before="0" w:line="240"/>
+              <w:ind w:firstLine="0"/>
+              <w:jc w:val="center"/>
+            </w:pPr>
+            <w:r>
+              <w:rPr>
+                <w:rFonts w:ascii="Times New Roman" w:cs="Times New Roman" w:eastAsia="Times New Roman" w:hAnsi="Times New Roman"/>
+                <w:b w:val="false"/>
+                <w:bCs w:val="false"/>
+                <w:caps w:val="false"/>
+                <w:sz w:val="16"/>
+                <w:szCs w:val="16"/>
+              </w:rPr>
+              <w:t xml:space="preserve">0.697</w:t>
             </w:r>
           </w:p>
         </w:tc>
@@ -3641,7 +3930,7 @@
       <w:tr>
         <w:tc>
           <w:tcPr>
-            <w:tcW w:type="dxa" w:w="2000"/>
+            <w:tcW w:type="dxa" w:w="1811"/>
             <w:tcBorders>
               <w:top w:val="none" w:color="FFFFFF" w:sz="0"/>
               <w:left w:val="none" w:color="FFFFFF" w:sz="0"/>
@@ -3677,7 +3966,7 @@
         </w:tc>
         <w:tc>
           <w:tcPr>
-            <w:tcW w:type="dxa" w:w="960"/>
+            <w:tcW w:type="dxa" w:w="746"/>
             <w:tcBorders>
               <w:top w:val="none" w:color="FFFFFF" w:sz="0"/>
               <w:left w:val="none" w:color="FFFFFF" w:sz="0"/>
@@ -3713,7 +4002,7 @@
         </w:tc>
         <w:tc>
           <w:tcPr>
-            <w:tcW w:type="dxa" w:w="960"/>
+            <w:tcW w:type="dxa" w:w="746"/>
             <w:tcBorders>
               <w:top w:val="none" w:color="FFFFFF" w:sz="0"/>
               <w:left w:val="none" w:color="FFFFFF" w:sz="0"/>
@@ -3749,7 +4038,7 @@
         </w:tc>
         <w:tc>
           <w:tcPr>
-            <w:tcW w:type="dxa" w:w="960"/>
+            <w:tcW w:type="dxa" w:w="746"/>
             <w:tcBorders>
               <w:top w:val="none" w:color="FFFFFF" w:sz="0"/>
               <w:left w:val="none" w:color="FFFFFF" w:sz="0"/>
@@ -3780,6 +4069,42 @@
                 <w:szCs w:val="16"/>
               </w:rPr>
               <w:t xml:space="preserve">0.831</w:t>
+            </w:r>
+          </w:p>
+        </w:tc>
+        <w:tc>
+          <w:tcPr>
+            <w:tcW w:type="dxa" w:w="831"/>
+            <w:tcBorders>
+              <w:top w:val="none" w:color="FFFFFF" w:sz="0"/>
+              <w:left w:val="none" w:color="FFFFFF" w:sz="0"/>
+              <w:bottom w:val="none" w:color="FFFFFF" w:sz="0"/>
+              <w:right w:val="none" w:color="FFFFFF" w:sz="0"/>
+            </w:tcBorders>
+            <w:shd w:fill="FFFFFF" w:val="clear"/>
+            <w:tcMar>
+              <w:top w:type="dxa" w:w="40"/>
+              <w:left w:type="dxa" w:w="80"/>
+              <w:bottom w:type="dxa" w:w="40"/>
+              <w:right w:type="dxa" w:w="80"/>
+            </w:tcMar>
+          </w:tcPr>
+          <w:p>
+            <w:pPr>
+              <w:spacing w:after="0" w:before="0" w:line="240"/>
+              <w:ind w:firstLine="0"/>
+              <w:jc w:val="center"/>
+            </w:pPr>
+            <w:r>
+              <w:rPr>
+                <w:rFonts w:ascii="Times New Roman" w:cs="Times New Roman" w:eastAsia="Times New Roman" w:hAnsi="Times New Roman"/>
+                <w:b w:val="false"/>
+                <w:bCs w:val="false"/>
+                <w:caps w:val="false"/>
+                <w:sz w:val="16"/>
+                <w:szCs w:val="16"/>
+              </w:rPr>
+              <w:t xml:space="preserve">0.844</w:t>
             </w:r>
           </w:p>
         </w:tc>
@@ -3787,7 +4112,7 @@
       <w:tr>
         <w:tc>
           <w:tcPr>
-            <w:tcW w:type="dxa" w:w="2000"/>
+            <w:tcW w:type="dxa" w:w="1811"/>
             <w:tcBorders>
               <w:top w:val="none" w:color="FFFFFF" w:sz="0"/>
               <w:left w:val="none" w:color="FFFFFF" w:sz="0"/>
@@ -3823,7 +4148,7 @@
         </w:tc>
         <w:tc>
           <w:tcPr>
-            <w:tcW w:type="dxa" w:w="960"/>
+            <w:tcW w:type="dxa" w:w="746"/>
             <w:tcBorders>
               <w:top w:val="none" w:color="FFFFFF" w:sz="0"/>
               <w:left w:val="none" w:color="FFFFFF" w:sz="0"/>
@@ -3859,7 +4184,7 @@
         </w:tc>
         <w:tc>
           <w:tcPr>
-            <w:tcW w:type="dxa" w:w="960"/>
+            <w:tcW w:type="dxa" w:w="746"/>
             <w:tcBorders>
               <w:top w:val="none" w:color="FFFFFF" w:sz="0"/>
               <w:left w:val="none" w:color="FFFFFF" w:sz="0"/>
@@ -3895,7 +4220,7 @@
         </w:tc>
         <w:tc>
           <w:tcPr>
-            <w:tcW w:type="dxa" w:w="960"/>
+            <w:tcW w:type="dxa" w:w="746"/>
             <w:tcBorders>
               <w:top w:val="none" w:color="FFFFFF" w:sz="0"/>
               <w:left w:val="none" w:color="FFFFFF" w:sz="0"/>
@@ -3926,6 +4251,42 @@
                 <w:szCs w:val="16"/>
               </w:rPr>
               <w:t xml:space="preserve">0.596</w:t>
+            </w:r>
+          </w:p>
+        </w:tc>
+        <w:tc>
+          <w:tcPr>
+            <w:tcW w:type="dxa" w:w="831"/>
+            <w:tcBorders>
+              <w:top w:val="none" w:color="FFFFFF" w:sz="0"/>
+              <w:left w:val="none" w:color="FFFFFF" w:sz="0"/>
+              <w:bottom w:val="single" w:color="000000" w:sz="12"/>
+              <w:right w:val="none" w:color="FFFFFF" w:sz="0"/>
+            </w:tcBorders>
+            <w:shd w:fill="FFFFFF" w:val="clear"/>
+            <w:tcMar>
+              <w:top w:type="dxa" w:w="40"/>
+              <w:left w:type="dxa" w:w="80"/>
+              <w:bottom w:type="dxa" w:w="40"/>
+              <w:right w:type="dxa" w:w="80"/>
+            </w:tcMar>
+          </w:tcPr>
+          <w:p>
+            <w:pPr>
+              <w:spacing w:after="0" w:before="0" w:line="240"/>
+              <w:ind w:firstLine="0"/>
+              <w:jc w:val="center"/>
+            </w:pPr>
+            <w:r>
+              <w:rPr>
+                <w:rFonts w:ascii="Times New Roman" w:cs="Times New Roman" w:eastAsia="Times New Roman" w:hAnsi="Times New Roman"/>
+                <w:b w:val="false"/>
+                <w:bCs w:val="false"/>
+                <w:caps w:val="false"/>
+                <w:sz w:val="16"/>
+                <w:szCs w:val="16"/>
+              </w:rPr>
+              <w:t xml:space="preserve">0.762</w:t>
             </w:r>
           </w:p>
         </w:tc>
@@ -3952,7 +4313,7 @@
           <w:sz w:val="20"/>
           <w:szCs w:val="20"/>
         </w:rPr>
-        <w:t xml:space="preserve">U-Net is most robust in 8 of 9 conditions. The sole exception is extreme contrast reduction (×0.4), where Random Forest (0.648) outperforms U-Net (0.596), likely because the spatial attention mechanism of U-Net relies on contrast cues whereas global colour statistics are more contrast-tolerant.</w:t>
+        <w:t xml:space="preserve">Among the clean-trained models, U-Net (M3) is most robust in 8 of 9 conditions. The sole exception is extreme contrast reduction (×0.4), where Random Forest (0.648) outperforms baseline U-Net (0.596). The distortion-augmented variant M3-R directly addresses this weakness: its IoU under extreme contrast rises to 0.762 (+0.166 over M3), reclaiming the top position. M3-R also improves over M3 on noise and blur conditions. The trade-off is a small clean-data IoU drop (0.874 → 0.861) and reduced brightness robustness, a classic accuracy–robustness trade-off.</w:t>
       </w:r>
     </w:p>
     <w:p>
@@ -5154,7 +5515,7 @@
           <w:sz w:val="20"/>
           <w:szCs w:val="20"/>
         </w:rPr>
-        <w:t xml:space="preserve">The U-Net used here is lightweight (base channels = 16) to support CPU training. Increasing model capacity or training for more epochs would likely push IoU above 0.90, approaching state-of-the-art values reported for this dataset. Additionally, the robustness experiment trains on clean data; augmenting with distorted images during training may further improve robustness, particularly for the contrast and noise conditions where the largest IoU drops are observed.</w:t>
+        <w:t xml:space="preserve">The U-Net used here is lightweight (base channels = 16) to support CPU training. Increasing model capacity or training for more epochs would likely push IoU above 0.90, approaching state-of-the-art values reported for this dataset. Additionally, the distortion-augmented variant M3-R improves contrast and noise robustness but shows reduced brightness robustness, suggesting the augmentation distribution could be further tuned (e.g., increasing brightness distortion frequency). A curriculum strategy that gradually increases distortion severity may also reduce the small clean-data accuracy trade-off (0.874 → 0.861).</w:t>
       </w:r>
     </w:p>
     <w:p>
@@ -5208,7 +5569,7 @@
           <w:sz w:val="20"/>
           <w:szCs w:val="20"/>
         </w:rPr>
-        <w:t xml:space="preserve">Key findings: (1) a clear seasonal failure mode in classical colour-based segmentation; (2) counter-intuitive robustness gain of ExG under Gaussian noise; (3) superior extreme-contrast robustness of Random Forest over U-Net; and (4) high data efficiency for both learning-based methods. Future work should explore season-invariant features for classical methods, larger U-Net variants with distortion augmentation, and semi-supervised approaches to further reduce annotation requirements.</w:t>
+        <w:t xml:space="preserve">Key findings: (1) a clear seasonal failure mode in classical colour-based segmentation; (2) counter-intuitive robustness gain of ExG under Gaussian noise; (3) distortion augmentation recovers the extreme-contrast weakness of U-Net (IoU 0.596 → 0.762, +0.166) with a small clean-data cost (−0.013); and (4) high data efficiency for both learning-based methods. Future work should explore season-invariant features, curriculum distortion training, and semi-supervised approaches to further reduce annotation requirements.</w:t>
       </w:r>
     </w:p>
     <w:p>

</xml_diff>

<commit_message>
Fix two inaccuracies found during code review
- TABLE V: correct 'Local ExG stats' from 2 to 3 dims — code actually
  computes exg_mean, exg_variance, AND exgr_mean (3 features, not 2);
  total remains 26 but row description was incomplete
- Method 1: clarify that Watershed and GrabCut variants use different
  vegetation score coefficients; GrabCut omits the gradient suppression
  term (1.5·ExG + 0.9·Gd + 0.35·Sat vs 1.7·ExG + 0.9·Gd + 0.4·Sat
  − 0.15·|∇|); note that all reported results use Watershed variant

Co-Authored-By: Claude Sonnet 4.6 <noreply@anthropic.com>
</commit_message>
<xml_diff>
--- a/reports/COMP9517_Group_Project_Report.docx
+++ b/reports/COMP9517_Group_Project_Report.docx
@@ -567,7 +567,7 @@
           <w:sz w:val="20"/>
           <w:szCs w:val="20"/>
         </w:rPr>
-        <w:t xml:space="preserve">Seeds are extracted by percentile thresholding: pixels above the foreground percentile (θₜ) are labelled definite foreground; pixels below the background percentile (θ₂) are definite background. The remainder is marked unknown. Two segmentation variants share this seeding: (a) ‘Watershed’ runs scipy watershed_ift on the gradient image; (b) ‘GrabCut’ uses OpenCV grabCut for iterative GMM refinement. Output masks are post-processed with morphological opening and closing, followed by removal of connected components smaller than 96 pixels.</w:t>
+        <w:t xml:space="preserve">Seeds are extracted by percentile thresholding: pixels above the foreground percentile (θₜ) are labelled definite foreground; pixels below the background percentile (θ₂) are definite background. The remainder is marked unknown. Two segmentation variants share this seeding framework but use slightly different vegetation score coefficients: (a) ‘Watershed’ uses the formula above and runs scipy watershed_ift on the gradient image; (b) ‘GrabCut’ uses a simplified score (1.5·ExG + 0.9·Gₑ + 0.35·Sat, without the gradient suppression term) and runs OpenCV grabCut for iterative GMM refinement. All reported results use the Watershed variant. Output masks are post-processed with morphological opening and closing, followed by removal of connected components smaller than 96 pixels.</w:t>
       </w:r>
     </w:p>
     <w:p>
@@ -1259,7 +1259,7 @@
                 <w:sz w:val="16"/>
                 <w:szCs w:val="16"/>
               </w:rPr>
-              <w:t xml:space="preserve">Local ExG stats</w:t>
+              <w:t xml:space="preserve">Local ExG/ExGR stats</w:t>
             </w:r>
           </w:p>
         </w:tc>
@@ -1295,7 +1295,7 @@
                 <w:sz w:val="16"/>
                 <w:szCs w:val="16"/>
               </w:rPr>
-              <w:t xml:space="preserve">2</w:t>
+              <w:t xml:space="preserve">3</w:t>
             </w:r>
           </w:p>
         </w:tc>
@@ -1331,7 +1331,7 @@
                 <w:sz w:val="16"/>
                 <w:szCs w:val="16"/>
               </w:rPr>
-              <w:t xml:space="preserve">Mean and std of ExG in 9×9 window</w:t>
+              <w:t xml:space="preserve">ExG mean; ExG std; ExGR mean in 9×9 window</w:t>
             </w:r>
           </w:p>
         </w:tc>

</xml_diff>

<commit_message>
Add report & PPT; remove PDFs and copyright files from tracking
- Add reports/COMP9517_Presentation.pptx (17-slide deck, all data verified)
- Add reports/fig1_qualitative.png (regenerated with correct IoU labels)
- Update reports/COMP9517_Group_Project_Report.docx (group name Vision Pro, member list, +0.044 fix)
- Add scripts/generate_ppt.js (PPT generation script)
- Update scripts/generate_report.js (group metadata, typo fix)
- Update .gitignore to exclude PDFs, references/, .claude/, report template
- Untrack assignment PDFs (university copyright), reference paper, report template
- Remove docs/method_selection.md (superseded by report)
- Update src/ algorithm files and utils

Co-Authored-By: Claude Sonnet 4.6 <noreply@anthropic.com>
</commit_message>
<xml_diff>
--- a/reports/COMP9517_Group_Project_Report.docx
+++ b/reports/COMP9517_Group_Project_Report.docx
@@ -35,7 +35,25 @@
           <w:sz w:val="22"/>
           <w:szCs w:val="22"/>
         </w:rPr>
-        <w:t xml:space="preserve">COMP9517 Group Project Team</w:t>
+        <w:t xml:space="preserve">Chenci Liu, Jianyu Zhou, Junwen Xue, Liuyunan He, Mengyang Yuan</w:t>
+      </w:r>
+    </w:p>
+    <w:p>
+      <w:pPr>
+        <w:spacing w:after="20" w:before="0"/>
+        <w:ind w:firstLine="0"/>
+        <w:jc w:val="center"/>
+      </w:pPr>
+      <w:r>
+        <w:rPr>
+          <w:rFonts w:ascii="Times New Roman" w:cs="Times New Roman" w:eastAsia="Times New Roman" w:hAnsi="Times New Roman"/>
+          <w:b w:val="false"/>
+          <w:bCs w:val="false"/>
+          <w:caps w:val="false"/>
+          <w:sz w:val="20"/>
+          <w:szCs w:val="20"/>
+        </w:rPr>
+        <w:t xml:space="preserve">Group “Vision Pro” — COMP9517 Computer Vision</w:t>
       </w:r>
     </w:p>
     <w:p>
@@ -100,7 +118,7 @@
           <w:sz w:val="18"/>
           <w:szCs w:val="18"/>
         </w:rPr>
-        <w:t xml:space="preserve">—This paper presents a systematic comparison of three computer vision approaches to wheat crop segmentation using the Eschikon Wheat Segmentation (EWS) benchmark dataset, which contains 190 RGB field images (350×350 pixels) captured across a complete growing season from February to May 2017. The three methods represent fundamentally different paradigms: (1) a training-free classical approach combining Excess Green vegetation indices with Watershed segmentation; (2) a machine learning approach using a 26-dimensional handcrafted feature vector with a Random Forest classifier; and (3) a deep learning approach using a lightweight U-Net encoder-decoder with skip connections and Dice+BCE loss. Evaluation on the held-out test set yields IoU scores of 0.415, 0.850, and 0.874 respectively. In-depth analysis reveals a critical seasonal failure of the classical method (monthly average IoU declining from 0.713 in February to 0.272 in May as wheat changes colour from green to golden-yellow), high data efficiency of both learning-based methods (near-peak IoU with only 35 training images), and a targeted robustness improvement: training U-Net with strong distortion augmentation raises IoU under extreme contrast reduction from 0.596 to 0.762 (+0.166), demonstrating a clear analysis–improvement loop.</w:t>
+        <w:t xml:space="preserve">—This paper presents a systematic comparison of three computer vision approaches to wheat crop segmentation using the Eschikon Wheat Segmentation (EWS) benchmark dataset, which contains 190 RGB field images (350×350 pixels) spanning multiple growing seasons from 2017 to 2020. The training set covers November to April across four years with no May images; the test set is drawn exclusively from 2017, including seven May images not seen during training. The three methods represent fundamentally different paradigms: (1) a training-free classical approach combining Excess Green vegetation indices with Watershed segmentation; (2) a machine learning approach using a 26-dimensional handcrafted feature vector with a Random Forest classifier; and (3) a deep learning approach using a lightweight U-Net encoder-decoder with skip connections and Dice+BCE loss. Evaluation on the held-out test set yields IoU scores of 0.415, 0.850, and 0.874 respectively. Our analysis shows that the classical method fails on late-season images (IoU drops from 0.713 in February to 0.272 in May as canopy closure, leaf shadows, and fragmented background make reliable seed placement increasingly difficult for the classical method), while both learning-based methods work well with as few as 35 training images. Training U-Net with stronger data augmentation improves its robustness to contrast reduction, raising IoU from 0.596 to 0.762 (+0.166).</w:t>
       </w:r>
     </w:p>
     <w:p>
@@ -194,7 +212,7 @@
           <w:sz w:val="20"/>
           <w:szCs w:val="20"/>
         </w:rPr>
-        <w:t xml:space="preserve">The challenge is deceptively difficult. Unlike controlled laboratory conditions, field images exhibit substantial variation in illumination, shadow, plant density, and — critically — plant appearance across the growing season. Early-season wheat is distinctly green and easily separated from brown soil by colour cues alone. By late spring, however, ripening wheat turns golden-yellow, causing colour-based classical methods to fail catastrophically. Real-world deployment also introduces image quality degradation from camera shake, dirt on lenses, and variable lighting conditions.</w:t>
+        <w:t xml:space="preserve">The challenge is deceptively difficult. Unlike controlled laboratory conditions, field images exhibit substantial variation in illumination, shadow, plant density, and — critically — plant appearance across the growing season. Early-season wheat is distinctly green against bare brown soil, making colour-based separation straightforward. By late spring, two factors make colour-based separation harder: plant coverage grows from under 2% in February to over 55% in May, and background ExG rises as weeds and ground cover develop between the wheat rows, increasing spectral overlap between plant and background pixels. Real-world deployment also introduces image quality degradation from camera shake, dirt on lenses, and variable lighting conditions.</w:t>
       </w:r>
     </w:p>
     <w:p>
@@ -212,7 +230,7 @@
           <w:sz w:val="20"/>
           <w:szCs w:val="20"/>
         </w:rPr>
-        <w:t xml:space="preserve">This study addresses these challenges through a rigorous three-way comparison of paradigms on the publicly available EWS dataset [2]. Our contributions are: (1) implementation and comparison of Watershed and GrabCut variants for classical segmentation with ExG-guided seed extraction; (2) a 26-dimensional handcrafted feature pipeline with Random Forest classification and probability-threshold tuning; (3) a lightweight U-Net trained with Dice+BCE loss and colour augmentation; (4) in-depth seasonal failure analysis identifying a month-by-month collapse in classical method performance; (5) a systematic robustness benchmark under nine distortion conditions, with a targeted distortion-augmentation improvement that recovers the extreme-contrast weakness of U-Net; and (6) a training data efficiency study across four subsampling levels.</w:t>
+        <w:t xml:space="preserve">This report compares three different segmentation approaches on the publicly available EWS dataset [2]: (1) a classical method using Watershed and GrabCut with vegetation index seeding; (2) a machine learning method using handcrafted features with a Random Forest classifier; and (3) a deep learning method using a lightweight U-Net. We also evaluate seasonal performance, robustness to image distortions, and the effect of reducing training data size.</w:t>
       </w:r>
     </w:p>
     <w:p>
@@ -265,7 +283,7 @@
           <w:sz w:val="20"/>
           <w:szCs w:val="20"/>
         </w:rPr>
-        <w:t xml:space="preserve">Early work on plant segmentation exploited the spectral difference between chlorophyll-rich vegetation and bare soil. The Excess Green index ExG = 2G − R − B introduced by Woebbecke et al. [4] remains a foundational feature because it is parameter-free and produces large positive values for green vegetation. Subsequent indices such as the Excess Red (ExR) and the combined ExGR extend discriminability to more complex scenes.</w:t>
+        <w:t xml:space="preserve">Early work on plant segmentation exploited the spectral difference between chlorophyll-rich vegetation and bare soil. The Excess Green index ExG = 2G − R − B introduced by Woebbecke et al. [4] remains a foundational feature because it is parameter-free and produces large positive values for green vegetation. Related indices such as Excess Red (ExR) and ExGR also help separate vegetation from background in more difficult images.</w:t>
       </w:r>
     </w:p>
     <w:p>
@@ -318,7 +336,7 @@
           <w:sz w:val="20"/>
           <w:szCs w:val="20"/>
         </w:rPr>
-        <w:t xml:space="preserve">Pixel-wise classification with handcrafted features has been widely applied to plant and crop segmentation. The key design question is which features capture the multi-scale appearance of vegetation reliably across growing conditions. Colour space transformations, local statistical descriptors, and gradient features complement raw pixel values to provide invariance to illumination changes [2]. Random Forests [6] are a natural ensemble classifier for this task: they handle high-dimensional correlated features, provide calibrated class probabilities, and support threshold tuning to optimise a target metric such as IoU.</w:t>
+        <w:t xml:space="preserve">Pixel-wise classification with handcrafted features has been widely applied to plant and crop segmentation. The key design question is which features capture the multi-scale appearance of vegetation reliably across growing conditions. Colour space transformations, local statistical descriptors, and gradient features complement raw pixel values to provide invariance to illumination changes [2]. Random Forests [6] are a natural ensemble classifier for this task: they can handle many input features and output probability scores for each class, which allows threshold tuning to improve IoU.</w:t>
       </w:r>
     </w:p>
     <w:p>
@@ -336,7 +354,7 @@
           <w:sz w:val="20"/>
           <w:szCs w:val="20"/>
         </w:rPr>
-        <w:t xml:space="preserve">The EWS benchmark paper [2] demonstrates that pixel-wise classifiers with carefully engineered features achieve IoU above 0.80 on seasonal wheat data. Our implementation extends this line of work with a systematic 26-dimensional feature set and grid-searched probability threshold.</w:t>
+        <w:t xml:space="preserve">The EWS benchmark paper [2] demonstrates that pixel-wise classifiers with carefully engineered features achieve IoU above 0.80 on seasonal wheat data. We use a 26-dimensional feature set and tune the classification threshold on the validation set.</w:t>
       </w:r>
     </w:p>
     <w:p>
@@ -371,7 +389,7 @@
           <w:sz w:val="20"/>
           <w:szCs w:val="20"/>
         </w:rPr>
-        <w:t xml:space="preserve">Fully Convolutional Networks (FCN) [9] established the paradigm of replacing classification heads with upsampling layers for dense prediction. U-Net [1] introduced symmetric skip connections between encoder and decoder stages, enabling precise localisation even with limited training data — a property particularly valuable for agricultural datasets where annotation is costly. Zenkl et al. [2] reported IoU values of 0.85–0.95 for deep learning models on EWS. More recent work incorporates depth information [7] or foundation models [8] to further improve robustness.</w:t>
+        <w:t xml:space="preserve">Fully Convolutional Networks (FCN) [8] established the paradigm of replacing classification heads with upsampling layers for dense prediction. U-Net [1] introduced symmetric skip connections between encoder and decoder stages, enabling precise localisation even with limited training data — a property particularly valuable for agricultural datasets where annotation is costly. Zenkl et al. [2] reported IoU values of 0.85–0.95 for deep learning models on EWS. More recent work incorporates depth information [7] to further improve robustness.</w:t>
       </w:r>
     </w:p>
     <w:p>
@@ -389,7 +407,7 @@
           <w:sz w:val="20"/>
           <w:szCs w:val="20"/>
         </w:rPr>
-        <w:t xml:space="preserve">Data augmentation is a crucial component of deep learning training for small agricultural datasets. Standard augmentations include geometric transforms (flips, rotations) and photometric transforms (brightness, contrast, noise). Training with distortion augmentation that matches the expected test-time degradations has been shown to improve robustness in general image classification, but its systematic effect on segmentation metrics under specific distortion types has received less attention.</w:t>
+        <w:t xml:space="preserve">Data augmentation is important when training on small datasets. We apply standard augmentations such as flips, brightness and contrast changes, and Gaussian noise. We also test whether adding stronger distortions during training can improve robustness against specific image quality problems.</w:t>
       </w:r>
     </w:p>
     <w:p>
@@ -442,7 +460,7 @@
           <w:sz w:val="20"/>
           <w:szCs w:val="20"/>
         </w:rPr>
-        <w:t xml:space="preserve">The EWS dataset [2] contains 190 RGB images (350×350 pixels) captured at the Eschikon field station, ETH Zurich, using a fixed overhead camera mounted above wheat plots. Images span the complete growing season from 22 February 2017 to 17 May 2017, covering tillering, stem elongation, heading, and ripening stages. Each image is paired with a manually annotated binary mask (wheat pixel = 1, soil/background = 0).</w:t>
+        <w:t xml:space="preserve">The EWS dataset [2] contains 190 RGB images (350×350 pixels) captured at the Eschikon field station, ETH Zurich, using a fixed overhead camera mounted above wheat plots. The dataset spans multiple growing seasons from 2017 to 2020. The training set (142 images) covers November to April across years 2017–2020 and contains no May images. The validation and test sets (24 images each) are drawn exclusively from 2017, covering February to May; the test set includes seven May images representing the densest canopy stage not seen during training. Each image is paired with a manually annotated binary mask (wheat pixel = 1, soil/background = 0).</w:t>
       </w:r>
     </w:p>
     <w:p>
@@ -460,7 +478,7 @@
           <w:sz w:val="20"/>
           <w:szCs w:val="20"/>
         </w:rPr>
-        <w:t xml:space="preserve">We adopt the canonical train/validation/test split: 142 training, 24 validation, and 24 test images. The split is provided by the dataset authors and maintained throughout all experiments to ensure comparability. Split disjointness is verified programmatically before each experiment to preclude data leakage. Hyperparameters are tuned exclusively on the validation set; the test set is reserved for final evaluation only.</w:t>
+        <w:t xml:space="preserve">All hyperparameters are tuned on the validation set; the test set is only used for final evaluation.</w:t>
       </w:r>
     </w:p>
     <w:p>
@@ -478,24 +496,122 @@
           <w:sz w:val="20"/>
           <w:szCs w:val="20"/>
         </w:rPr>
-        <w:t xml:space="preserve">Five evaluation metrics are computed per image and averaged across the test set: Intersection over Union (IoU = TP∕(TP+FP+FN)), F1-score (= 2·Prec·Recall∕(Prec+Recall)), Precision (=TP∕(TP+FP)), Recall (=TP∕(TP+FN)), and Pixel Accuracy (=correct pixels∕total pixels). Training and inference times are measured with wall-clock timing on an Apple M-series CPU.</w:t>
-      </w:r>
-    </w:p>
-    <w:p>
-      <w:pPr>
-        <w:spacing w:after="60" w:before="120"/>
+        <w:t xml:space="preserve">Five evaluation metrics are computed per image and averaged across the test set:</w:t>
+      </w:r>
+    </w:p>
+    <w:p>
+      <w:pPr>
+        <w:spacing w:after="60" w:before="60" w:line="276" w:lineRule="auto"/>
         <w:ind w:firstLine="0"/>
-      </w:pPr>
-      <w:r>
-        <w:rPr>
-          <w:rFonts w:ascii="Times New Roman" w:cs="Times New Roman" w:eastAsia="Times New Roman" w:hAnsi="Times New Roman"/>
-          <w:b w:val="false"/>
-          <w:bCs w:val="false"/>
-          <w:caps w:val="false"/>
+        <w:jc w:val="center"/>
+      </w:pPr>
+      <m:oMath>
+        <m:r>
+          <m:t>IoU = </m:t>
+        </m:r>
+        <m:f>
+          <m:num>
+            <m:r>
+              <m:t>TP</m:t>
+            </m:r>
+          </m:num>
+          <m:den>
+            <m:r>
+              <m:t>TP+FP+FN</m:t>
+            </m:r>
+          </m:den>
+        </m:f>
+      </m:oMath>
+    </w:p>
+    <w:p>
+      <w:pPr>
+        <w:spacing w:after="60" w:before="60" w:line="276" w:lineRule="auto"/>
+        <w:ind w:firstLine="0"/>
+        <w:jc w:val="center"/>
+      </w:pPr>
+      <m:oMath>
+        <m:r>
+          <m:t>F1 = </m:t>
+        </m:r>
+        <m:f>
+          <m:num>
+            <m:r>
+              <m:t>2⋅Prec⋅Recall</m:t>
+            </m:r>
+          </m:num>
+          <m:den>
+            <m:r>
+              <m:t>Prec+Recall</m:t>
+            </m:r>
+          </m:den>
+        </m:f>
+      </m:oMath>
+    </w:p>
+    <w:p>
+      <w:pPr>
+        <w:spacing w:after="60" w:before="60" w:line="276" w:lineRule="auto"/>
+        <w:ind w:firstLine="0"/>
+        <w:jc w:val="center"/>
+      </w:pPr>
+      <m:oMath>
+        <m:r>
+          <m:t>Prec = </m:t>
+        </m:r>
+        <m:f>
+          <m:num>
+            <m:r>
+              <m:t>TP</m:t>
+            </m:r>
+          </m:num>
+          <m:den>
+            <m:r>
+              <m:t>TP+FP</m:t>
+            </m:r>
+          </m:den>
+        </m:f>
+      </m:oMath>
+      <w:r>
+        <w:rPr>
+          <w:rFonts w:ascii="Times New Roman" w:cs="Times New Roman" w:eastAsia="Times New Roman" w:hAnsi="Times New Roman"/>
           <w:sz w:val="20"/>
           <w:szCs w:val="20"/>
         </w:rPr>
-        <w:t xml:space="preserve">B. Method 1: ExG-guided Watershed / GrabCut</w:t>
+        <w:t xml:space="preserve">  </w:t>
+      </w:r>
+      <m:oMath>
+        <m:r>
+          <m:t>Recall = </m:t>
+        </m:r>
+        <m:f>
+          <m:num>
+            <m:r>
+              <m:t>TP</m:t>
+            </m:r>
+          </m:num>
+          <m:den>
+            <m:r>
+              <m:t>TP+FN</m:t>
+            </m:r>
+          </m:den>
+        </m:f>
+      </m:oMath>
+    </w:p>
+    <w:p>
+      <w:pPr>
+        <w:spacing w:after="80" w:before="0" w:line="240" w:lineRule="auto"/>
+        <w:ind w:firstLine="0"/>
+        <w:jc w:val="center"/>
+      </w:pPr>
+      <w:r>
+        <w:rPr>
+          <w:rFonts w:ascii="Times New Roman" w:cs="Times New Roman" w:eastAsia="Times New Roman" w:hAnsi="Times New Roman"/>
+          <w:b w:val="false"/>
+          <w:bCs w:val="false"/>
+          <w:caps w:val="false"/>
+          <w:sz w:val="20"/>
+          <w:szCs w:val="20"/>
+        </w:rPr>
+        <w:t xml:space="preserve">PA = correct pixels / total pixels</w:t>
       </w:r>
     </w:p>
     <w:p>
@@ -513,14 +629,13 @@
           <w:sz w:val="20"/>
           <w:szCs w:val="20"/>
         </w:rPr>
-        <w:t xml:space="preserve">Method 1 is a training-free classical pipeline. A per-pixel composite vegetation score S aggregates four complementary cues:</w:t>
-      </w:r>
-    </w:p>
-    <w:p>
-      <w:pPr>
-        <w:spacing w:after="120" w:before="0" w:line="240" w:lineRule="auto"/>
+        <w:t xml:space="preserve">Training and inference times are measured with wall-clock timing on an Apple M-series CPU.</w:t>
+      </w:r>
+    </w:p>
+    <w:p>
+      <w:pPr>
+        <w:spacing w:after="60" w:before="120"/>
         <w:ind w:firstLine="0"/>
-        <w:jc w:val="both"/>
       </w:pPr>
       <w:r>
         <w:rPr>
@@ -531,7 +646,7 @@
           <w:sz w:val="20"/>
           <w:szCs w:val="20"/>
         </w:rPr>
-        <w:t xml:space="preserve">S = 1.7·ExG + 0.9·Gₑ + 0.4·Sat − 0.15·|∇|</w:t>
+        <w:t xml:space="preserve">B. Method 1: ExG-guided Watershed / GrabCut</w:t>
       </w:r>
     </w:p>
     <w:p>
@@ -549,8 +664,36 @@
           <w:sz w:val="20"/>
           <w:szCs w:val="20"/>
         </w:rPr>
-        <w:t xml:space="preserve">where ExG is the Excess Green index, Gₑ is normalised green dominance (G/(R+G+B)), Sat is HSV saturation, and |∇| is Sobel edge magnitude (subtracted to suppress spurious seeds at boundaries). S is smoothed with a Gaussian blur (σ = 1.0) before seed extraction.</w:t>
-      </w:r>
+        <w:t xml:space="preserve">Method 1 is a training-free classical pipeline. A per-pixel composite vegetation score S aggregates four complementary cues:</w:t>
+      </w:r>
+    </w:p>
+    <w:p>
+      <w:pPr>
+        <w:spacing w:after="60" w:before="60" w:line="276" w:lineRule="auto"/>
+        <w:ind w:firstLine="0"/>
+        <w:jc w:val="center"/>
+      </w:pPr>
+      <m:oMath>
+        <m:r>
+          <m:t>S = 1.7⋅ExG + 0.9⋅</m:t>
+        </m:r>
+        <m:sSub>
+          <m:sSubPr/>
+          <m:e>
+            <m:r>
+              <m:t>G</m:t>
+            </m:r>
+          </m:e>
+          <m:sub>
+            <m:r>
+              <m:t>e</m:t>
+            </m:r>
+          </m:sub>
+        </m:sSub>
+        <m:r>
+          <m:t> + 0.4⋅Sat − 0.15⋅|∇|</m:t>
+        </m:r>
+      </m:oMath>
     </w:p>
     <w:p>
       <w:pPr>
@@ -567,7 +710,7 @@
           <w:sz w:val="20"/>
           <w:szCs w:val="20"/>
         </w:rPr>
-        <w:t xml:space="preserve">Seeds are extracted by percentile thresholding: pixels above the foreground percentile (θₜ) are labelled definite foreground; pixels below the background percentile (θ₂) are definite background. The remainder is marked unknown. Two segmentation variants share this seeding framework but use slightly different vegetation score coefficients: (a) ‘Watershed’ uses the formula above and runs scipy watershed_ift on the gradient image; (b) ‘GrabCut’ uses a simplified score (1.5·ExG + 0.9·Gₑ + 0.35·Sat, without the gradient suppression term) and runs OpenCV grabCut for iterative GMM refinement. All reported results use the Watershed variant. Output masks are post-processed with morphological opening and closing, followed by removal of connected components smaller than 96 pixels.</w:t>
+        <w:t xml:space="preserve">where ExG is the Excess Green index [4], Gₑ is normalised green dominance (G/(R+G+B)), Sat is HSV saturation, and |∇| is Sobel edge magnitude (subtracted to suppress spurious seeds at boundaries). S is smoothed with a Gaussian blur (σ = 1.0) before seed extraction.</w:t>
       </w:r>
     </w:p>
     <w:p>
@@ -585,24 +728,7 @@
           <w:sz w:val="20"/>
           <w:szCs w:val="20"/>
         </w:rPr>
-        <w:t xml:space="preserve">A grid search over three parameters tunes on the validation set: θₜ ∈ {75, 80, 85, 90}, θ₂ ∈ {10, 15, 20, 25}, and a spatial majority filter threshold ∈ {0.45, 0.48, 0.50, 0.52}. Best validation IoU is 0.444 (Watershed variant), which is selected for all test-set evaluations.</w:t>
-      </w:r>
-    </w:p>
-    <w:p>
-      <w:pPr>
-        <w:spacing w:after="60" w:before="120"/>
-        <w:ind w:firstLine="0"/>
-      </w:pPr>
-      <w:r>
-        <w:rPr>
-          <w:rFonts w:ascii="Times New Roman" w:cs="Times New Roman" w:eastAsia="Times New Roman" w:hAnsi="Times New Roman"/>
-          <w:b w:val="false"/>
-          <w:bCs w:val="false"/>
-          <w:caps w:val="false"/>
-          <w:sz w:val="20"/>
-          <w:szCs w:val="20"/>
-        </w:rPr>
-        <w:t xml:space="preserve">C. Method 2: Handcrafted Features + Random Forest</w:t>
+        <w:t xml:space="preserve">Seeds are extracted by percentile thresholding: pixels above the foreground percentile (θₜ) are labelled definite foreground; pixels below the background percentile (θ₂) are definite background. The remainder is marked unknown. Two segmentation variants share this seeding framework but use slightly different vegetation score coefficients: (a) ‘Watershed’ uses the formula above and runs scipy watershed_ift on the gradient image [9]; (b) ‘GrabCut’ uses a simplified score (1.5·ExG + 0.9·Gₑ + 0.35·Sat, without the gradient suppression term) and runs OpenCV grabCut for iterative GMM refinement [5][10]. Both variants were evaluated on the validation set; GrabCut achieved slightly higher validation IoU (0.472 vs. 0.444), but requires much longer parameter tuning time due to iterative GMM optimisation. Watershed was selected for all reported results as the preferred trade-off between accuracy and speed. Output masks are post-processed with morphological opening (size 2) and closing (size 3), followed by removal of connected components smaller than 96 pixels.</w:t>
       </w:r>
     </w:p>
     <w:p>
@@ -620,7 +746,42 @@
           <w:sz w:val="20"/>
           <w:szCs w:val="20"/>
         </w:rPr>
-        <w:t xml:space="preserve">Method 2 trains a pixel classifier on a 26-dimensional feature vector per pixel (Table V). Features are organised into seven groups spanning colour, texture, vegetation indices, and gradient information, providing multi-scale representation that complements vegetation indices with local spatial context.</w:t>
+        <w:t xml:space="preserve">A grid search over three parameters tunes on the validation set: θₜ ∈ {75, 80, 85, 90}, θ₂ ∈ {10, 15, 20, 25}, and a spatial majority filter threshold ∈ {0.45, 0.48, 0.50, 0.52}. Best validation IoU is 0.444 (Watershed variant), which is selected for all test-set evaluations.</w:t>
+      </w:r>
+    </w:p>
+    <w:p>
+      <w:pPr>
+        <w:spacing w:after="60" w:before="120"/>
+        <w:ind w:firstLine="0"/>
+      </w:pPr>
+      <w:r>
+        <w:rPr>
+          <w:rFonts w:ascii="Times New Roman" w:cs="Times New Roman" w:eastAsia="Times New Roman" w:hAnsi="Times New Roman"/>
+          <w:b w:val="false"/>
+          <w:bCs w:val="false"/>
+          <w:caps w:val="false"/>
+          <w:sz w:val="20"/>
+          <w:szCs w:val="20"/>
+        </w:rPr>
+        <w:t xml:space="preserve">C. Method 2: Handcrafted Features + Random Forest</w:t>
+      </w:r>
+    </w:p>
+    <w:p>
+      <w:pPr>
+        <w:spacing w:after="120" w:before="0" w:line="240" w:lineRule="auto"/>
+        <w:ind w:firstLine="288"/>
+        <w:jc w:val="both"/>
+      </w:pPr>
+      <w:r>
+        <w:rPr>
+          <w:rFonts w:ascii="Times New Roman" w:cs="Times New Roman" w:eastAsia="Times New Roman" w:hAnsi="Times New Roman"/>
+          <w:b w:val="false"/>
+          <w:bCs w:val="false"/>
+          <w:caps w:val="false"/>
+          <w:sz w:val="20"/>
+          <w:szCs w:val="20"/>
+        </w:rPr>
+        <w:t xml:space="preserve">Method 2 trains a pixel classifier on a 26-dimensional feature vector per pixel (Table I). Features are organised into seven groups spanning colour, texture, vegetation indices, and gradient information, giving the classifier a more complete description of each pixel's appearance.</w:t>
       </w:r>
     </w:p>
     <w:p>
@@ -638,7 +799,7 @@
           <w:sz w:val="16"/>
           <w:szCs w:val="16"/>
         </w:rPr>
-        <w:t xml:space="preserve">TABLE V</w:t>
+        <w:t xml:space="preserve">TABLE I</w:t>
       </w:r>
     </w:p>
     <w:p>
@@ -1001,7 +1162,7 @@
                 <w:sz w:val="16"/>
                 <w:szCs w:val="16"/>
               </w:rPr>
-              <w:t xml:space="preserve">r=R/(R+G+B), g=G/(R+G+B), b=B/(R+G+B)</w:t>
+              <w:t xml:space="preserve">r = R/(R+G+B), g = G/(R+G+B), b = B/(R+G+B)</w:t>
             </w:r>
           </w:p>
         </w:tc>
@@ -1221,7 +1382,7 @@
                 <w:sz w:val="16"/>
                 <w:szCs w:val="16"/>
               </w:rPr>
-              <w:t xml:space="preserve">ExG=2G−R−B; ExR=1.4R−G; ExGR=ExG−ExR</w:t>
+              <w:t xml:space="preserve">ExG = 2G−R−B; ExR = 1.4R−G; ExGR = ExG−ExR</w:t>
             </w:r>
           </w:p>
         </w:tc>
@@ -1331,7 +1492,7 @@
                 <w:sz w:val="16"/>
                 <w:szCs w:val="16"/>
               </w:rPr>
-              <w:t xml:space="preserve">ExG mean; ExG std; ExGR mean in 9×9 window</w:t>
+              <w:t xml:space="preserve">ExG mean; ExG var; ExGR mean in 9×9 window</w:t>
             </w:r>
           </w:p>
         </w:tc>
@@ -1441,7 +1602,7 @@
                 <w:sz w:val="16"/>
                 <w:szCs w:val="16"/>
               </w:rPr>
-              <w:t xml:space="preserve">Grey intensity, local mean, local std</w:t>
+              <w:t xml:space="preserve">Grey intensity, local mean, local var</w:t>
             </w:r>
           </w:p>
         </w:tc>
@@ -1688,7 +1849,7 @@
           <w:sz w:val="20"/>
           <w:szCs w:val="20"/>
         </w:rPr>
-        <w:t xml:space="preserve">A scikit-learn RandomForestClassifier with 250 trees and maximum depth 20 is trained on balanced pixel samples: 4,000 randomly sampled pixels per training image, with equal class proportions, yielding approximately 566,000 training pixels. Balanced sampling prevents the dominant soil class from overwhelming the classifier. A classification probability threshold is selected from candidates {0.35, 0.40, 0.45, 0.50, 0.55, 0.60, 0.65} to maximise validation IoU; the optimal threshold is 0.35, indicating that the forest assigns relatively low confidence to wheat pixels — consistent with the high class imbalance in late-season images. Post-processing is identical to Method 1.</w:t>
+        <w:t xml:space="preserve">A scikit-learn RandomForestClassifier [6][11] with 250 trees and maximum depth 20 is trained on balanced pixel samples: 4,000 randomly sampled pixels per training image, with equal class proportions, yielding approximately 566,000 training pixels. Balanced sampling prevents the dominant soil class from overwhelming the classifier. A classification probability threshold is selected from candidates {0.35, 0.40, 0.45, 0.50, 0.55, 0.60, 0.65} to maximise validation IoU; the optimal threshold is 0.35, indicating that the forest assigns relatively low confidence to wheat pixels — likely because late-season images exhibit high spectral overlap between plant and background pixels, making classification genuinely ambiguous. Post-processing applies morphological closing (size 2) and removal of connected components smaller than 96 pixels.</w:t>
       </w:r>
     </w:p>
     <w:p>
@@ -1723,7 +1884,7 @@
           <w:sz w:val="20"/>
           <w:szCs w:val="20"/>
         </w:rPr>
-        <w:t xml:space="preserve">Method 3 uses a lightweight U-Net with base channel width 16. The encoder consists of three DownBlocks, each comprising a double-convolution unit (Conv2d–BN–ReLU×2) followed by 2×2 max pooling, producing feature maps at 16, 32, and 64 channels respectively. A bottleneck double-convolution at 128 channels captures global context. The decoder mirrors the encoder with three UpBlocks (bilinear upsampling + skip concatenation + double convolution). A 1×1 convolutional head with sigmoid activation produces the probability map. Total trainable parameters: approximately 480,000.</w:t>
+        <w:t xml:space="preserve">Method 3 uses a lightweight U-Net [1] with base channel width 16. The encoder consists of three DownBlocks, each comprising a double-convolution unit (Conv2d–BN–ReLU×2) followed by 2×2 max pooling, producing feature maps at 16, 32, and 64 channels respectively. A bottleneck double-convolution at 128 channels captures global context. The decoder mirrors the encoder with three UpBlocks (bilinear upsampling + skip concatenation + double convolution). A 1×1 convolutional head with sigmoid activation produces the probability map. Total trainable parameters: approximately 490,000.</w:t>
       </w:r>
     </w:p>
     <w:p>
@@ -1741,7 +1902,7 @@
           <w:sz w:val="20"/>
           <w:szCs w:val="20"/>
         </w:rPr>
-        <w:t xml:space="preserve">Training minimises the sum of Dice loss and binary cross-entropy (BCE). Dice loss directly optimises the IoU-related overlap score and is insensitive to class imbalance; BCE provides stable gradient at the pixel level. The Adam optimiser (lr = 0.001) is used with batch size 4 for 20 epochs. The checkpoint achieving the highest validation IoU (0.870 at epoch 20) is restored before test-set evaluation. The decision threshold is tuned on the validation set, yielding 0.6 (higher than default 0.5, reflecting that the network is slightly over-confident on the positive class).</w:t>
+        <w:t xml:space="preserve">The model is implemented in PyTorch [12]. Training minimises the sum of Dice loss and binary cross-entropy (BCE). Dice loss directly optimises the IoU-related overlap score and is insensitive to class imbalance; BCE provides stable gradient at the pixel level. The Adam optimiser (lr = 0.001) is used with batch size 4 for 20 epochs. The checkpoint achieving the highest validation IoU (0.870 at epoch 20) is restored before test-set evaluation. The decision threshold is tuned on the validation set, yielding 0.6.</w:t>
       </w:r>
     </w:p>
     <w:p>
@@ -1812,7 +1973,7 @@
           <w:sz w:val="20"/>
           <w:szCs w:val="20"/>
         </w:rPr>
-        <w:t xml:space="preserve">Table I reports all five evaluation metrics and timing on the 24-image test set. The two learning-based methods substantially outperform the classical baseline across every metric.</w:t>
+        <w:t xml:space="preserve">Table II reports all five evaluation metrics and timing on the 24-image test set. The two learning-based methods substantially outperform the classical baseline across every metric.</w:t>
       </w:r>
     </w:p>
     <w:p>
@@ -1830,7 +1991,7 @@
           <w:sz w:val="16"/>
           <w:szCs w:val="16"/>
         </w:rPr>
-        <w:t xml:space="preserve">TABLE I</w:t>
+        <w:t xml:space="preserve">TABLE II</w:t>
       </w:r>
     </w:p>
     <w:p>
@@ -3055,7 +3216,7 @@
           <w:sz w:val="20"/>
           <w:szCs w:val="20"/>
         </w:rPr>
-        <w:t xml:space="preserve">Method 1 (Watershed) achieves IoU 0.415, Precision 0.574, and Recall 0.585. The near-equal precision and recall suggest that the ExG-based seeds partition errors symmetrically between false positives and false negatives rather than systematically mis-classifying one class. The low Pixel Accuracy (0.431) is consistent with a method that partially succeeds on some images and fails completely on others.</w:t>
+        <w:t xml:space="preserve">Method 1 (Watershed) achieves IoU 0.415, Precision 0.574, and Recall 0.585. The low overall performance is mainly caused by failure on late-season May images, where plant coverage rises to ~57% and background vegetation increases spectral overlap between plant and soil pixels, making reliable seed placement for the watershed algorithm increasingly difficult. Precision and Recall are similar, suggesting the method does not strongly favour false positives or false negatives.</w:t>
       </w:r>
     </w:p>
     <w:p>
@@ -3073,7 +3234,7 @@
           <w:sz w:val="20"/>
           <w:szCs w:val="20"/>
         </w:rPr>
-        <w:t xml:space="preserve">Method 2 (Random Forest) achieves IoU 0.850 and F1 0.916, with high and near-balanced Precision (0.915) and Recall (0.926). The optimal probability threshold of 0.35 — lower than the conventional 0.50 — suggests that the forest’s per-pixel confidence scores are systematically under-confident for wheat, likely because late-season images dominate the training distribution and reduce per-pixel vegetation confidence.</w:t>
+        <w:t xml:space="preserve">Method 2 (Random Forest) achieves IoU 0.850 and F1 0.916, with balanced Precision (0.915) and Recall (0.926). The optimal classification threshold tuned on the validation set is 0.35, lower than the default 0.50, which improved IoU by including more wheat pixels that the classifier assigned moderate confidence.</w:t>
       </w:r>
     </w:p>
     <w:p>
@@ -3091,7 +3252,7 @@
           <w:sz w:val="20"/>
           <w:szCs w:val="20"/>
         </w:rPr>
-        <w:t xml:space="preserve">Method 3 (U-Net) achieves the highest score on all metrics: IoU 0.874, F1 0.931, Precision 0.922, Recall 0.941, Pixel Accuracy 0.923. It also trains slightly faster (119 s vs. 126 s) and is 11.6× faster at inference (0.028 vs. 0.325 s/image) compared to Random Forest. The inference speed advantage makes U-Net more practical for large-scale field monitoring where thousands of images must be processed.</w:t>
+        <w:t xml:space="preserve">Method 3 (U-Net) achieves the highest score on all metrics: IoU 0.874, F1 0.931, Precision 0.922, Recall 0.941, Pixel Accuracy 0.923. It also trains in a similar time to Random Forest (119 s vs. 126 s) and is 11.6× faster at inference (0.028 vs. 0.325 s/image). The inference speed advantage makes U-Net more practical for large-scale field monitoring where thousands of images must be processed.</w:t>
       </w:r>
     </w:p>
     <w:p>
@@ -3126,7 +3287,7 @@
           <w:sz w:val="20"/>
           <w:szCs w:val="20"/>
         </w:rPr>
-        <w:t xml:space="preserve">Table II breaks down test-set performance by calendar month for all three methods. The seasonal gradient is striking for Method 1 but is also present, to a lesser degree, in the learning-based methods.</w:t>
+        <w:t xml:space="preserve">Table III breaks down test-set performance by calendar month for all three methods. The seasonal gradient is striking for Method 1 but is also present, to a lesser degree, in the learning-based methods.</w:t>
       </w:r>
     </w:p>
     <w:p>
@@ -3144,7 +3305,7 @@
           <w:sz w:val="16"/>
           <w:szCs w:val="16"/>
         </w:rPr>
-        <w:t xml:space="preserve">TABLE II</w:t>
+        <w:t xml:space="preserve">TABLE III</w:t>
       </w:r>
     </w:p>
     <w:p>
@@ -4298,7 +4459,7 @@
           <w:sz w:val="20"/>
           <w:szCs w:val="20"/>
         </w:rPr>
-        <w:t xml:space="preserve">Method 1 collapses dramatically: average IoU falls from 0.713 (February, n = 2) to 0.573 (March), 0.292 (April), and 0.272 (May). The February and early-March images (green wheat shoots) are straightforward for ExG-based segmentation; by April the chlorophyll content drops sharply as wheat enters the ripening phase, reducing the ExG score of wheat pixels to near-soil values. The worst individual test image (20170505) achieves IoU = 0.086, indicating near-total segmentation failure.</w:t>
+        <w:t xml:space="preserve">Method 1 collapses dramatically: average IoU falls from 0.713 (February, n = 2) to 0.573 (March), 0.292 (April), and 0.272 (May). The February images show small wheat shoots (covering only ~2% of the image) against large expanses of bare soil, giving the watershed algorithm a clear clear spectral contrast between plant and background. By May, two changes combine to cause failure: plant coverage rises to ~57%, leaving less background area for seed placement; and background ExG rises as weeds or other ground cover develop between wheat rows, so that many background pixels become spectrally similar to plant pixels and seed placement becomes unreliable. The worst individual test image (20170505) achieves IoU = 0.086, indicating near-total segmentation failure.</w:t>
       </w:r>
     </w:p>
     <w:p>
@@ -4316,7 +4477,83 @@
           <w:sz w:val="20"/>
           <w:szCs w:val="20"/>
         </w:rPr>
-        <w:t xml:space="preserve">Methods 2 and 3 also show a seasonal decline, but it is far more gradual and never catastrophic: Method 2 drops from 0.977 (February) to 0.763 (May); Method 3 from 0.977 to 0.796. This decline reflects the fact that late-season images are intrinsically harder (more complex textures, overlapping ears, lodging effects) even for appearance-agnostic learned representations. Critically, both methods maintain IoU above 0.68 even on the worst May test images, compared to 0.086 for Method 1.</w:t>
+        <w:t xml:space="preserve">Methods 2 and 3 also show a seasonal decline, but it is much smaller: Method 2 drops from 0.977 (February) to 0.763 (May); Method 3 from 0.977 to 0.796. Two factors contribute: (1) the training set contains no May images, so both models must generalise to a canopy density not seen during weight fitting (though May images are present in the validation set, which is used for threshold and checkpoint selection); (2) the May images are visually harder due to dense overlapping leaves, heavy internal shadows, and reduced visible soil. Both methods still maintain IoU above 0.68 on the worst May test images, compared to 0.086 for Method 1.</w:t>
+      </w:r>
+    </w:p>
+    <w:p>
+      <w:pPr>
+        <w:spacing w:after="0" w:before="80"/>
+        <w:ind w:firstLine="0"/>
+        <w:jc w:val="center"/>
+      </w:pPr>
+      <w:r>
+        <w:drawing>
+          <wp:inline distT="0" distB="0" distL="0" distR="0">
+            <wp:extent cx="2857500" cy="590550"/>
+            <wp:effectExtent t="0" r="0" b="0" l="0"/>
+            <wp:docPr id="1" name="" descr="" title=""/>
+            <wp:cNvGraphicFramePr>
+              <a:graphicFrameLocks xmlns:a="http://schemas.openxmlformats.org/drawingml/2006/main" noChangeAspect="1"/>
+            </wp:cNvGraphicFramePr>
+            <a:graphic xmlns:a="http://schemas.openxmlformats.org/drawingml/2006/main">
+              <a:graphicData uri="http://schemas.openxmlformats.org/drawingml/2006/picture">
+                <pic:pic xmlns:pic="http://schemas.openxmlformats.org/drawingml/2006/picture">
+                  <pic:nvPicPr>
+                    <pic:cNvPr id="0" name="" descr=""/>
+                    <pic:cNvPicPr>
+                      <a:picLocks noChangeAspect="1" noChangeArrowheads="1"/>
+                    </pic:cNvPicPr>
+                  </pic:nvPicPr>
+                  <pic:blipFill>
+                    <a:blip r:embed="rId8" cstate="none"/>
+                    <a:srcRect/>
+                    <a:stretch>
+                      <a:fillRect/>
+                    </a:stretch>
+                  </pic:blipFill>
+                  <pic:spPr bwMode="auto">
+                    <a:xfrm>
+                      <a:off x="0" y="0"/>
+                      <a:ext cx="2857500" cy="590550"/>
+                    </a:xfrm>
+                    <a:prstGeom prst="rect">
+                      <a:avLst/>
+                    </a:prstGeom>
+                  </pic:spPr>
+                </pic:pic>
+              </a:graphicData>
+            </a:graphic>
+          </wp:inline>
+        </w:drawing>
+      </w:r>
+    </w:p>
+    <w:p>
+      <w:pPr>
+        <w:spacing w:after="120" w:before="40"/>
+        <w:ind w:firstLine="0"/>
+        <w:jc w:val="center"/>
+      </w:pPr>
+      <w:r>
+        <w:rPr>
+          <w:rFonts w:ascii="Times New Roman" w:cs="Times New Roman" w:eastAsia="Times New Roman" w:hAnsi="Times New Roman"/>
+          <w:b/>
+          <w:bCs/>
+          <w:caps w:val="false"/>
+          <w:sz w:val="16"/>
+          <w:szCs w:val="16"/>
+        </w:rPr>
+        <w:t xml:space="preserve">Fig. 1. </w:t>
+      </w:r>
+      <w:r>
+        <w:rPr>
+          <w:rFonts w:ascii="Times New Roman" w:cs="Times New Roman" w:eastAsia="Times New Roman" w:hAnsi="Times New Roman"/>
+          <w:b w:val="false"/>
+          <w:bCs w:val="false"/>
+          <w:caps w:val="false"/>
+          <w:sz w:val="16"/>
+          <w:szCs w:val="16"/>
+        </w:rPr>
+        <w:t xml:space="preserve">Qualitative segmentation results for a February image (top row) and a May image (bottom row). Each panel shows: input image, ground-truth mask, and predicted overlay for each method. Method 1 underperforms on the May image (IoU = 0.32) while Methods 2 and 3 maintain reasonable performance (IoU = 0.68 and 0.69 respectively).</w:t>
       </w:r>
     </w:p>
     <w:p>
@@ -4351,7 +4588,7 @@
           <w:sz w:val="20"/>
           <w:szCs w:val="20"/>
         </w:rPr>
-        <w:t xml:space="preserve">Table III reports IoU under nine distortion conditions. M3-R is the distortion-augmented U-Net variant trained with noise (σ∼[10,45]), blur (σ∼[1.0,3.5]), and brightness/contrast factor∼[0.35,0.75] applied randomly at 70% probability during training.</w:t>
+        <w:t xml:space="preserve">Table IV reports IoU under nine distortion conditions. M3-R is the distortion-augmented U-Net variant trained with noise (σ∼[10,45]), blur (σ∼[1.0,3.5]), and brightness/contrast factor∼[0.35,0.75] applied randomly at 70% probability during training.</w:t>
       </w:r>
     </w:p>
     <w:p>
@@ -4369,7 +4606,7 @@
           <w:sz w:val="16"/>
           <w:szCs w:val="16"/>
         </w:rPr>
-        <w:t xml:space="preserve">TABLE III</w:t>
+        <w:t xml:space="preserve">TABLE IV</w:t>
       </w:r>
     </w:p>
     <w:p>
@@ -6251,7 +6488,7 @@
           <w:sz w:val="20"/>
           <w:szCs w:val="20"/>
         </w:rPr>
-        <w:t xml:space="preserve">Among the clean-trained models, U-Net (M3) leads in 8 of 9 conditions. The exception is extreme contrast reduction (×0.4), where Random Forest (0.648) outperforms U-Net (0.596) by 0.052. This reversal can be explained architecturally: U-Net’s spatial attention in the encoder relies on contrast gradients to guide feature extraction, which collapse under strong contrast reduction. Random Forest’s global colour statistics are less sensitive to contrast scaling because they operate on normalised chromaticity features.</w:t>
+        <w:t xml:space="preserve">Among the clean-trained models, U-Net (M3) leads in 8 of 9 conditions. The exception is extreme contrast reduction (×0.4), where Random Forest (0.648) outperforms U-Net (0.596) by 0.052. This is likely because U-Net relies more heavily on contrast differences in the image to detect edges and boundaries, while Random Forest uses colour features that are less sensitive to overall contrast changes.</w:t>
       </w:r>
     </w:p>
     <w:p>
@@ -6269,7 +6506,7 @@
           <w:sz w:val="20"/>
           <w:szCs w:val="20"/>
         </w:rPr>
-        <w:t xml:space="preserve">The distortion-augmented variant M3-R directly addresses this weakness. Training exposure to contrast-reduced images enables the network to learn contrast-invariant features, raising extreme-contrast IoU from 0.596 to 0.762 (Δ+0.166). M3-R also improves over M3 on noise conditions (+0.007 and +0.043) and strong blur (+0.018). The trade-off is a small clean-data IoU reduction (0.874 → 0.861, −0.013) and reduced brightness robustness (−0.038 at mild, −0.042 at strong). This trade-off is a well-known accuracy-robustness phenomenon: exposure to one class of distortions can reduce performance on others unless the augmentation distribution is carefully balanced.</w:t>
+        <w:t xml:space="preserve">The distortion-augmented variant M3-R directly addresses this weakness. By training on contrast-reduced images, the network learns to handle low-contrast inputs better, raising IoU under extreme contrast reduction from 0.596 to 0.762 (+0.166). M3-R also improves over M3 on noise conditions (+0.007 and +0.044) and strong blur (+0.018). The trade-off is a small clean-data IoU reduction (0.874 → 0.861, −0.013) and reduced brightness robustness (−0.038 at mild, −0.042 at strong). This shows that training on specific distortions improves robustness to those distortions, but may slightly reduce performance in other conditions.</w:t>
       </w:r>
     </w:p>
     <w:p>
@@ -6287,7 +6524,7 @@
           <w:sz w:val="20"/>
           <w:szCs w:val="20"/>
         </w:rPr>
-        <w:t xml:space="preserve">A counter-intuitive finding is that Method 1 improves under Gaussian noise: IoU rises from 0.415 (clean) to 0.474 (σ=15) and 0.541 (σ=40). This occurs because the late-season test images contain uniform low-ExG regions of golden wheat. Gaussian noise introduces random intensity variation that partially disrupts this uniformity, creating false positive ExG responses that inadvertently recover some true foreground area. This counterintuitive benefit disappears for blur and brightness distortions, which preserve the spectral uniformity that confuses the ExG score.</w:t>
+        <w:t xml:space="preserve">An unexpected result is that Method 1 actually improves under Gaussian noise: IoU rises from 0.415 (clean) to 0.474 (σ=15) and 0.541 (σ=40). This is likely because random noise disrupts the ambiguous background pixels that were causing false seeds, and the post-processing step removes the many small noisy fragments that the watershed produces, leaving a cleaner segmentation. Smaller improvements also occur under brightness and contrast reduction, while Gaussian blur is the only distortion that consistently hurts M1, as it smooths out the gradient edges that the watershed relies on.</w:t>
       </w:r>
     </w:p>
     <w:p>
@@ -6322,7 +6559,7 @@
           <w:sz w:val="20"/>
           <w:szCs w:val="20"/>
         </w:rPr>
-        <w:t xml:space="preserve">Table IV shows IoU as the training set is reduced to 25%, 50%, 75%, and 100% of the 142 available training images. Method 1 is data-independent and serves as a flat reference.</w:t>
+        <w:t xml:space="preserve">Table V shows IoU as the training set is reduced to 25%, 50%, 75%, and 100% of the 142 available training images. Method 1 is data-independent and serves as a flat reference.</w:t>
       </w:r>
     </w:p>
     <w:p>
@@ -6340,7 +6577,7 @@
           <w:sz w:val="16"/>
           <w:szCs w:val="16"/>
         </w:rPr>
-        <w:t xml:space="preserve">TABLE IV</w:t>
+        <w:t xml:space="preserve">TABLE V</w:t>
       </w:r>
     </w:p>
     <w:p>
@@ -7312,7 +7549,7 @@
           <w:sz w:val="20"/>
           <w:szCs w:val="20"/>
         </w:rPr>
-        <w:t xml:space="preserve">Both learning-based methods demonstrate remarkable data efficiency. U-Net reaches IoU = 0.852 with only 35 images (25%), just 0.022 below its full-data score of 0.874. Performance increases monotonically with data, following a typical learning curve. Random Forest achieves IoU = 0.848 at 25% but dips to 0.826 at 50% before recovering to 0.850 at 100%. This non-monotonic behaviour reflects the stochastic nature of pixel subsampling: the 50% subset (71 images) may have sampled a less representative distribution of late-season images. At 100% training data, the performance gap between Random Forest and U-Net is only 0.024 IoU, suggesting that the information bottleneck at this scale lies in the feature representation rather than the amount of data. The strong data efficiency of both methods is encouraging for practical deployment, where annotating large numbers of field images is expensive.</w:t>
+        <w:t xml:space="preserve">Both learning-based methods demonstrate remarkable data efficiency. U-Net reaches IoU = 0.852 with only 35 images (25%), just 0.022 below its full-data score of 0.874. Performance generally improves as more training images are added. Random Forest achieves IoU = 0.848 at 25% but dips to 0.826 at 50% before recovering to 0.850 at 100%. This slight variation is likely due to the random selection of training images: the particular 50% subset may have underrepresented harder growth stages or certain year-to-year variation within the available training pool. Overall, both methods perform well even with limited training data, which is useful in practice since annotating field images is time-consuming.</w:t>
       </w:r>
     </w:p>
     <w:p>
@@ -7365,7 +7602,7 @@
           <w:sz w:val="20"/>
           <w:szCs w:val="20"/>
         </w:rPr>
-        <w:t xml:space="preserve">The three methods form a clear performance hierarchy: U-Net (IoU 0.874) &gt; Random Forest (0.850) &gt; Watershed (0.415). However, this ordering should be interpreted in context. On early-season images (February), all three methods achieve IoU above 0.685, and the Watershed method reaches 0.713 — competitive with the learning-based approaches at no training cost whatsoever. For operators who only need to segment green early-growth images, Method 1 may be perfectly adequate.</w:t>
+        <w:t xml:space="preserve">The three methods form a clear performance hierarchy: U-Net (IoU 0.874) &gt; Random Forest (0.850) &gt; Watershed (0.415). However, this ordering should be interpreted in context. On early-season February images, the Watershed method reaches IoU 0.713 with no training at all, though the learning-based methods score much higher (IoU 0.977 each). For operators who only need to process early-growth images where wheat is clearly green against bare soil, Method 1 may be sufficient without the overhead of collecting labelled data.</w:t>
       </w:r>
     </w:p>
     <w:p>
@@ -7418,7 +7655,7 @@
           <w:sz w:val="20"/>
           <w:szCs w:val="20"/>
         </w:rPr>
-        <w:t xml:space="preserve">Method 1’s failure is systematic and predictable: it is triggered by any condition that reduces the green channel dominance of wheat pixels. In our dataset this is primarily seasonal (ripening), but similar failure would be expected for winter wheat varieties, post-harvest stubble, or drought-stressed crops. A simple yet effective remedy would be to supplement ExG with near-infrared (NIR) reflectance, which remains high for live vegetation regardless of chlorophyll content.</w:t>
+        <w:t xml:space="preserve">Method 1’s failure follows a clear seasonal direction. In February, wheat shoots cover only ~2% of the image against bare soil, giving the watershed algorithm a clear spectral contrast for reliable seed placement. By May, two factors combine: plant coverage rises to ~57% (less background to seed from), and background ExG rises as weeds or other ground cover develop between wheat rows, making many background pixels spectrally similar to plant pixels. This spectral overlap, combined with less available background area, makes seed placement unreliable and causes the watershed to flood incorrectly. A possible remedy would be to supplement ExG with texture features that remain discriminative even when colour cues overlap.</w:t>
       </w:r>
     </w:p>
     <w:p>
@@ -7436,7 +7673,7 @@
           <w:sz w:val="20"/>
           <w:szCs w:val="20"/>
         </w:rPr>
-        <w:t xml:space="preserve">The worst-performing test image for Methods 2 and 3 is from 17 May 2017 (IoU ≈0.688 for both). Inspection reveals dense overlapping wheat ears creating a complex, highly textured foreground that differs markedly from the training distribution. Both methods also struggle with strongly shadowed boundary regions. These failure cases could be addressed by targeted augmentation (rotation, perspective warp) or by incorporating temporal context from sequential field images.</w:t>
+        <w:t xml:space="preserve">The worst-performing test image for Methods 2 and 3 is from 17 May 2017 (IoU ≈0.680 for Random Forest, ≈0.688 for U-Net). Inspection reveals dense overlapping leaves and heavy internal shadows creating a complex foreground that looks quite different from earlier training images. Both methods also struggle with strongly shadowed boundary regions. These issues could be improved by adding more augmentation during training, such as rotations and perspective changes.</w:t>
       </w:r>
     </w:p>
     <w:p>
@@ -7471,7 +7708,7 @@
           <w:sz w:val="20"/>
           <w:szCs w:val="20"/>
         </w:rPr>
-        <w:t xml:space="preserve">The M3-R experiment demonstrates a clear insight-to-improvement cycle: (1) the robustness benchmark identified that extreme contrast reduction was U-Net’s principal vulnerability; (2) distortion augmentation covering the training range (×[0.35, 0.75]) was added to training; (3) the weakness was largely resolved (+0.166 IoU). The residual trade-off — reduced brightness robustness in M3-R — points directly to the next improvement: adding brightness distortions to the augmentation mix with higher probability.</w:t>
+        <w:t xml:space="preserve">The M3-R experiment shows a direct connection between testing and improvement: the robustness results showed that extreme contrast reduction was U-Net's main weakness, so we added contrast distortions to the training augmentation and IoU improved by +0.166. The remaining issue is that M3-R performs worse under brightness changes despite brightness reduction already being included in its distortion augmentation (factor ∼[0.35, 0.75]). A likely cause is that brightness reduction is only one of four distortion types applied randomly during training, so the network sees relatively few brightness-reduced examples compared to what is needed to fully compensate.</w:t>
       </w:r>
     </w:p>
     <w:p>
@@ -7489,7 +7726,7 @@
           <w:sz w:val="20"/>
           <w:szCs w:val="20"/>
         </w:rPr>
-        <w:t xml:space="preserve">The clean-data cost of distortion augmentation (−0.013) is small but non-zero. This is the typical accuracy-robustness trade-off documented in adversarial training literature. A curriculum approach — starting training on clean images and gradually introducing distortions — may reduce this cost while preserving the robustness gains.</w:t>
+        <w:t xml:space="preserve">The trade-off is that M3-R scores slightly lower on clean images (0.874 → 0.861) and on brightness distortions. This suggests that adding more types of augmentation during training could help cover more distortion conditions without sacrificing clean performance.</w:t>
       </w:r>
     </w:p>
     <w:p>
@@ -7524,7 +7761,7 @@
           <w:sz w:val="20"/>
           <w:szCs w:val="20"/>
         </w:rPr>
-        <w:t xml:space="preserve">Several limitations of the current work deserve attention. First, the U-Net used here is deliberately lightweight (base channels = 16, ∼480K parameters) to support CPU-only training; larger architectures or pre-trained encoders (e.g., ResNet50 backbone) would likely push IoU above 0.90. Second, all methods are evaluated on a single wheat dataset at one geographic location; generalisation to other crop types, camera setups, or locations remains to be verified. Third, the robustness benchmark uses synthetic distortions; real-world degradations (e.g., motion blur from UAV vibration, rain drops) may have different characteristics. Finally, the seasonal analysis is based on a single growing season; inter-year variation could affect conclusions.</w:t>
+        <w:t xml:space="preserve">Several limitations of the current work deserve attention. First, the U-Net used here is deliberately lightweight (base channels = 16, ∼490K parameters) to support CPU-only training; larger architectures or pre-trained encoders (e.g., ResNet50 backbone) would likely push IoU above 0.90. Second, all methods are evaluated on a single wheat dataset at one geographic location; generalisation to other crop types, camera setups, or locations remains to be verified. Third, the robustness benchmark uses synthetic distortions; real-world degradations (e.g., motion blur from UAV vibration, rain drops) may have different characteristics. Finally, the seasonal analysis is based on a single growing season; inter-year variation could affect conclusions.</w:t>
       </w:r>
     </w:p>
     <w:p>
@@ -7560,7 +7797,7 @@
           <w:sz w:val="20"/>
           <w:szCs w:val="20"/>
         </w:rPr>
-        <w:t xml:space="preserve">We presented a comprehensive comparison of three wheat segmentation paradigms on the EWS dataset. The classical Watershed method, while parameter-free and fast, suffers a severe seasonal failure as monthly average IoU declines from 0.713 (February) to 0.272 (May), making it unsuitable for full-season deployment. The Random Forest classifier with a 26-dimensional handcrafted feature set achieves IoU = 0.850 and remains competitive with as few as 35 training images. The lightweight U-Net achieves the best performance (IoU = 0.874, F1 = 0.931) with substantially faster inference (0.028 s/image).</w:t>
+        <w:t xml:space="preserve">We compared three different approaches to wheat segmentation on the EWS dataset. The classical Watershed method, while parameter-free and fast, suffers a severe seasonal failure as monthly average IoU declines from 0.713 (February) to 0.272 (May), making it unsuitable for full-season deployment. The Random Forest classifier with a 26-dimensional handcrafted feature set achieves IoU = 0.850 and remains competitive with as few as 35 training images. The lightweight U-Net achieves the best performance (IoU = 0.874, F1 = 0.931) with substantially faster inference (0.028 s/image).</w:t>
       </w:r>
     </w:p>
     <w:p>
@@ -7578,7 +7815,7 @@
           <w:sz w:val="20"/>
           <w:szCs w:val="20"/>
         </w:rPr>
-        <w:t xml:space="preserve">Beyond the standard comparison, three original analyses strengthen the results. A month-by-month breakdown reveals that Methods 2 and 3 also show a gradual seasonal decline (IoU −0.181 and −0.181 from February to May respectively), though never approaching the catastrophic drop of Method 1. A systematic robustness benchmark identifies extreme contrast reduction as U-Net’s principal vulnerability, confirmed by an architectural explanation. Distortion augmentation (M3-R) specifically addresses this vulnerability, raising IoU from 0.596 to 0.762 (+0.166), closing the gap with Random Forest and illustrating a complete analysis–improvement loop.</w:t>
+        <w:t xml:space="preserve">Additional analysis showed that seasonal performance drops gradually for Methods 2 and 3 (Method 2 drops by 0.21, Method 3 by 0.18, from February to May), but neither fails as severely as Method 1. The robustness experiments identified extreme contrast reduction as the main weakness of U-Net. Training with distortion augmentation (M3-R) directly improved this, raising IoU from 0.596 to 0.762 (+0.166).</w:t>
       </w:r>
     </w:p>
     <w:p>
@@ -7596,7 +7833,7 @@
           <w:sz w:val="20"/>
           <w:szCs w:val="20"/>
         </w:rPr>
-        <w:t xml:space="preserve">Future directions include season-invariant feature engineering for classical methods (e.g., NIR-augmented ExG), curriculum distortion training to recover brightness robustness in M3-R, larger U-Net architectures with pre-trained encoders, and semi-supervised learning strategies to reduce annotation costs further.</w:t>
+        <w:t xml:space="preserve">Limitations include the small dataset and the fact that the seasonal analysis is based on a single 2017 test season, the lightweight U-Net architecture chosen for CPU training, and the use of synthetic distortions rather than real captured degradations. Future work could explore larger U-Net models, more diverse augmentation strategies, and testing on datasets from different crops or locations.</w:t>
       </w:r>
     </w:p>
     <w:p>
@@ -7750,7 +7987,7 @@
           <w:sz w:val="16"/>
           <w:szCs w:val="16"/>
         </w:rPr>
-        <w:t xml:space="preserve">[8]	Y. Zhang et al., “DepthCropSeg++: Scaling a crop segmentation foundation model with depth-labeled data,” IEEE J. Sel. Topics Signal Process., 2026.</w:t>
+        <w:t xml:space="preserve">[8]	J. Long, E. Shelhamer, and T. Darrell, “Fully convolutional networks for semantic segmentation,” in Proc. CVPR, 2015, pp. 3431–3440.</w:t>
       </w:r>
     </w:p>
     <w:p>
@@ -7767,7 +8004,58 @@
           <w:sz w:val="16"/>
           <w:szCs w:val="16"/>
         </w:rPr>
-        <w:t xml:space="preserve">[9]	J. Long, E. Shelhamer, and T. Darrell, “Fully convolutional networks for semantic segmentation,” in Proc. CVPR, 2015, pp. 3431–3440.</w:t>
+        <w:t xml:space="preserve">[9]	P. Virtanen et al., “SciPy 1.0: Fundamental algorithms for scientific computing in Python,” Nat. Methods, vol. 17, pp. 261–272, 2020.</w:t>
+      </w:r>
+    </w:p>
+    <w:p>
+      <w:pPr>
+        <w:spacing w:after="60" w:before="0"/>
+        <w:ind w:left="320" w:hanging="320" w:firstLine="0"/>
+      </w:pPr>
+      <w:r>
+        <w:rPr>
+          <w:rFonts w:ascii="Times New Roman" w:cs="Times New Roman" w:eastAsia="Times New Roman" w:hAnsi="Times New Roman"/>
+          <w:b w:val="false"/>
+          <w:bCs w:val="false"/>
+          <w:caps w:val="false"/>
+          <w:sz w:val="16"/>
+          <w:szCs w:val="16"/>
+        </w:rPr>
+        <w:t xml:space="preserve">[10]	G. Bradski, “The OpenCV library,” Dr. Dobb’s J. Softw. Tools, 2000.</w:t>
+      </w:r>
+    </w:p>
+    <w:p>
+      <w:pPr>
+        <w:spacing w:after="60" w:before="0"/>
+        <w:ind w:left="320" w:hanging="320" w:firstLine="0"/>
+      </w:pPr>
+      <w:r>
+        <w:rPr>
+          <w:rFonts w:ascii="Times New Roman" w:cs="Times New Roman" w:eastAsia="Times New Roman" w:hAnsi="Times New Roman"/>
+          <w:b w:val="false"/>
+          <w:bCs w:val="false"/>
+          <w:caps w:val="false"/>
+          <w:sz w:val="16"/>
+          <w:szCs w:val="16"/>
+        </w:rPr>
+        <w:t xml:space="preserve">[11]	F. Pedregosa et al., “Scikit-learn: Machine learning in Python,” J. Mach. Learn. Res., vol. 12, pp. 2825–2830, 2011.</w:t>
+      </w:r>
+    </w:p>
+    <w:p>
+      <w:pPr>
+        <w:spacing w:after="60" w:before="0"/>
+        <w:ind w:left="320" w:hanging="320" w:firstLine="0"/>
+      </w:pPr>
+      <w:r>
+        <w:rPr>
+          <w:rFonts w:ascii="Times New Roman" w:cs="Times New Roman" w:eastAsia="Times New Roman" w:hAnsi="Times New Roman"/>
+          <w:b w:val="false"/>
+          <w:bCs w:val="false"/>
+          <w:caps w:val="false"/>
+          <w:sz w:val="16"/>
+          <w:szCs w:val="16"/>
+        </w:rPr>
+        <w:t xml:space="preserve">[12]	A. Paszke et al., “PyTorch: An imperative style, high-performance deep learning library,” in Proc. NeurIPS, 2019, pp. 8024–8035.</w:t>
       </w:r>
     </w:p>
     <w:p>
@@ -7836,17 +8124,6 @@
       <w:ind w:firstLine="0"/>
       <w:jc w:val="center"/>
     </w:pPr>
-    <w:r>
-      <w:rPr>
-        <w:rFonts w:ascii="Times New Roman" w:cs="Times New Roman" w:eastAsia="Times New Roman" w:hAnsi="Times New Roman"/>
-        <w:b w:val="false"/>
-        <w:bCs w:val="false"/>
-        <w:caps w:val="false"/>
-        <w:sz w:val="16"/>
-        <w:szCs w:val="16"/>
-      </w:rPr>
-      <w:t xml:space="preserve">COMP9517 Computer Vision — UNSW 2026 T1   |   Page </w:t>
-    </w:r>
     <w:r>
       <w:rPr>
         <w:rFonts w:ascii="Times New Roman" w:cs="Times New Roman" w:eastAsia="Times New Roman" w:hAnsi="Times New Roman"/>

</xml_diff>